<commit_message>
update explainer and index
</commit_message>
<xml_diff>
--- a/build_2/html/Chronicle of a War Foretold.docx
+++ b/build_2/html/Chronicle of a War Foretold.docx
@@ -80,23 +80,35 @@
           <w:sz w:val="28"/>
           <w:szCs w:val="28"/>
         </w:rPr>
-        <w:t>Hundreds of Iranians were killed on that first day as munitions rained down on Iran. Among</w:t>
-      </w:r>
-      <w:r>
-        <w:rPr>
-          <w:rFonts w:ascii="Times New Roman" w:hAnsi="Times New Roman" w:cs="Times New Roman"/>
-          <w:sz w:val="28"/>
-          <w:szCs w:val="28"/>
-        </w:rPr>
-        <w:t xml:space="preserve">st </w:t>
-      </w:r>
-      <w:r>
-        <w:rPr>
-          <w:rFonts w:ascii="Times New Roman" w:hAnsi="Times New Roman" w:cs="Times New Roman"/>
-          <w:sz w:val="28"/>
-          <w:szCs w:val="28"/>
-        </w:rPr>
-        <w:t>the dead was Supreme Leader Ayatollah Ali Khamenei, who had ruled the nation without reprieve since 1989.</w:t>
+        <w:t>Hundreds of Iranians were killed on that first day as munitions rained down on Iran. Amongst the dead was Supreme Leader Ayatollah Ali Khamenei, who had ruled the nation without reprieve since 1989.</w:t>
+      </w:r>
+      <w:r>
+        <w:rPr>
+          <w:rFonts w:ascii="Times New Roman" w:hAnsi="Times New Roman" w:cs="Times New Roman"/>
+          <w:sz w:val="28"/>
+          <w:szCs w:val="28"/>
+        </w:rPr>
+      </w:r>
+      <w:r>
+        <w:rPr>
+          <w:rFonts w:ascii="Times New Roman" w:hAnsi="Times New Roman" w:cs="Times New Roman"/>
+          <w:sz w:val="28"/>
+          <w:szCs w:val="28"/>
+        </w:rPr>
+      </w:r>
+      <w:r>
+        <w:rPr>
+          <w:rFonts w:ascii="Times New Roman" w:hAnsi="Times New Roman" w:cs="Times New Roman"/>
+          <w:sz w:val="28"/>
+          <w:szCs w:val="28"/>
+        </w:rPr>
+      </w:r>
+      <w:r>
+        <w:rPr>
+          <w:rFonts w:ascii="Times New Roman" w:hAnsi="Times New Roman" w:cs="Times New Roman"/>
+          <w:sz w:val="28"/>
+          <w:szCs w:val="28"/>
+        </w:rPr>
       </w:r>
     </w:p>
     <w:p>
@@ -280,79 +292,70 @@
           <w:sz w:val="28"/>
           <w:szCs w:val="28"/>
         </w:rPr>
-        <w:t xml:space="preserve">One hour before the strike, Amazon's EU-WEST-2 data </w:t>
-      </w:r>
-      <w:r>
-        <w:rPr>
-          <w:rFonts w:ascii="Times New Roman" w:hAnsi="Times New Roman" w:cs="Times New Roman"/>
-          <w:sz w:val="28"/>
-          <w:szCs w:val="28"/>
-        </w:rPr>
-        <w:t>center</w:t>
-      </w:r>
-      <w:r>
-        <w:rPr>
-          <w:rFonts w:ascii="Times New Roman" w:hAnsi="Times New Roman" w:cs="Times New Roman"/>
-          <w:sz w:val="28"/>
-          <w:szCs w:val="28"/>
-        </w:rPr>
-        <w:t>s</w:t>
-      </w:r>
-      <w:r>
-        <w:rPr>
-          <w:rFonts w:ascii="Times New Roman" w:hAnsi="Times New Roman" w:cs="Times New Roman"/>
-          <w:sz w:val="28"/>
-          <w:szCs w:val="28"/>
-        </w:rPr>
-        <w:t xml:space="preserve"> </w:t>
-      </w:r>
-      <w:r>
-        <w:rPr>
-          <w:rFonts w:ascii="Times New Roman" w:hAnsi="Times New Roman" w:cs="Times New Roman"/>
-          <w:sz w:val="28"/>
-          <w:szCs w:val="28"/>
-        </w:rPr>
-        <w:t>saw a sudden spike in trading activity</w:t>
-      </w:r>
-      <w:r>
-        <w:rPr>
-          <w:rFonts w:ascii="Times New Roman" w:hAnsi="Times New Roman" w:cs="Times New Roman"/>
-          <w:sz w:val="28"/>
-          <w:szCs w:val="28"/>
-        </w:rPr>
-        <w:t xml:space="preserve">. A small group of </w:t>
-      </w:r>
-      <w:r>
-        <w:rPr>
-          <w:rFonts w:ascii="Times New Roman" w:hAnsi="Times New Roman" w:cs="Times New Roman"/>
-          <w:sz w:val="28"/>
-          <w:szCs w:val="28"/>
-        </w:rPr>
-        <w:t>accounts</w:t>
-      </w:r>
-      <w:r>
-        <w:rPr>
-          <w:rFonts w:ascii="Times New Roman" w:hAnsi="Times New Roman" w:cs="Times New Roman"/>
-          <w:sz w:val="28"/>
-          <w:szCs w:val="28"/>
-        </w:rPr>
-        <w:t>, most of them with no trading history, had placed well-timed bets on the start of a war in Iran. They would make a</w:t>
-      </w:r>
-      <w:r>
-        <w:rPr>
-          <w:rFonts w:ascii="Times New Roman" w:hAnsi="Times New Roman" w:cs="Times New Roman"/>
-          <w:sz w:val="28"/>
-          <w:szCs w:val="28"/>
-        </w:rPr>
-        <w:t>n estimated</w:t>
-      </w:r>
-      <w:r>
-        <w:rPr>
-          <w:rFonts w:ascii="Times New Roman" w:hAnsi="Times New Roman" w:cs="Times New Roman"/>
-          <w:sz w:val="28"/>
-          <w:szCs w:val="28"/>
-        </w:rPr>
-        <w:t xml:space="preserve"> total of $6,073,083 in profits.</w:t>
+        <w:t>One hour before the strike, Amazon's EU-WEST-2 data centers saw a sudden spike in trading activity. A small group of accounts, most of them with no trading history, had placed well-timed bets on the start of a war in Iran. They would make an estimated total of US$6,073,083 in profits.</w:t>
+      </w:r>
+      <w:r>
+        <w:rPr>
+          <w:rFonts w:ascii="Times New Roman" w:hAnsi="Times New Roman" w:cs="Times New Roman"/>
+          <w:sz w:val="28"/>
+          <w:szCs w:val="28"/>
+        </w:rPr>
+      </w:r>
+      <w:r>
+        <w:rPr>
+          <w:rFonts w:ascii="Times New Roman" w:hAnsi="Times New Roman" w:cs="Times New Roman"/>
+          <w:sz w:val="28"/>
+          <w:szCs w:val="28"/>
+        </w:rPr>
+      </w:r>
+      <w:r>
+        <w:rPr>
+          <w:rFonts w:ascii="Times New Roman" w:hAnsi="Times New Roman" w:cs="Times New Roman"/>
+          <w:sz w:val="28"/>
+          <w:szCs w:val="28"/>
+        </w:rPr>
+      </w:r>
+      <w:r>
+        <w:rPr>
+          <w:rFonts w:ascii="Times New Roman" w:hAnsi="Times New Roman" w:cs="Times New Roman"/>
+          <w:sz w:val="28"/>
+          <w:szCs w:val="28"/>
+        </w:rPr>
+      </w:r>
+      <w:r>
+        <w:rPr>
+          <w:rFonts w:ascii="Times New Roman" w:hAnsi="Times New Roman" w:cs="Times New Roman"/>
+          <w:sz w:val="28"/>
+          <w:szCs w:val="28"/>
+        </w:rPr>
+      </w:r>
+      <w:r>
+        <w:rPr>
+          <w:rFonts w:ascii="Times New Roman" w:hAnsi="Times New Roman" w:cs="Times New Roman"/>
+          <w:sz w:val="28"/>
+          <w:szCs w:val="28"/>
+        </w:rPr>
+      </w:r>
+      <w:r>
+        <w:rPr>
+          <w:rFonts w:ascii="Times New Roman" w:hAnsi="Times New Roman" w:cs="Times New Roman"/>
+          <w:sz w:val="28"/>
+          <w:szCs w:val="28"/>
+        </w:rPr>
+      </w:r>
+      <w:r>
+        <w:rPr>
+          <w:rFonts w:ascii="Times New Roman" w:hAnsi="Times New Roman" w:cs="Times New Roman"/>
+          <w:sz w:val="28"/>
+          <w:szCs w:val="28"/>
+        </w:rPr>
+      </w:r>
+      <w:r>
+        <w:rPr>
+          <w:rFonts w:ascii="Times New Roman" w:hAnsi="Times New Roman" w:cs="Times New Roman"/>
+          <w:sz w:val="28"/>
+          <w:szCs w:val="28"/>
+        </w:rPr>
       </w:r>
     </w:p>
     <w:p>
@@ -370,23 +373,21 @@
           <w:sz w:val="28"/>
           <w:szCs w:val="28"/>
         </w:rPr>
-        <w:t>One of the biggest winners</w:t>
-      </w:r>
-      <w:r>
-        <w:rPr>
-          <w:rFonts w:ascii="Times New Roman" w:hAnsi="Times New Roman" w:cs="Times New Roman"/>
-          <w:sz w:val="28"/>
-          <w:szCs w:val="28"/>
-        </w:rPr>
-        <w:t xml:space="preserve"> that morning</w:t>
-      </w:r>
-      <w:r>
-        <w:rPr>
-          <w:rFonts w:ascii="Times New Roman" w:hAnsi="Times New Roman" w:cs="Times New Roman"/>
-          <w:sz w:val="28"/>
-          <w:szCs w:val="28"/>
-        </w:rPr>
-        <w:t xml:space="preserve"> was Vivaldi007. The account made US$629,184 by accurately predicting the day of the strike, the successful assasination of Khamenei, as well as Israel's close participation.</w:t>
+        <w:t>One of the biggest winners that morning was Vivaldi007. The account made US$629,184 by accurately predicting the day of the strike, the successful assassination of Khamenei, as well as Israel's close participation.</w:t>
+      </w:r>
+      <w:r>
+        <w:rPr>
+          <w:rFonts w:ascii="Times New Roman" w:hAnsi="Times New Roman" w:cs="Times New Roman"/>
+          <w:sz w:val="28"/>
+          <w:szCs w:val="28"/>
+        </w:rPr>
+      </w:r>
+      <w:r>
+        <w:rPr>
+          <w:rFonts w:ascii="Times New Roman" w:hAnsi="Times New Roman" w:cs="Times New Roman"/>
+          <w:sz w:val="28"/>
+          <w:szCs w:val="28"/>
+        </w:rPr>
       </w:r>
     </w:p>
     <w:p>
@@ -404,55 +405,49 @@
           <w:sz w:val="28"/>
           <w:szCs w:val="28"/>
         </w:rPr>
-        <w:t>Despite the exceptional foresight, Vivaldi007</w:t>
-      </w:r>
-      <w:r>
-        <w:rPr>
-          <w:rFonts w:ascii="Times New Roman" w:hAnsi="Times New Roman" w:cs="Times New Roman"/>
-          <w:sz w:val="28"/>
-          <w:szCs w:val="28"/>
-        </w:rPr>
-        <w:t xml:space="preserve"> did not continue to trade on the conflict. </w:t>
-      </w:r>
-      <w:r>
-        <w:rPr>
-          <w:rFonts w:ascii="Times New Roman" w:hAnsi="Times New Roman" w:cs="Times New Roman"/>
-          <w:sz w:val="28"/>
-          <w:szCs w:val="28"/>
-        </w:rPr>
-        <w:t>USD$</w:t>
-      </w:r>
-      <w:r>
-        <w:rPr>
-          <w:rFonts w:ascii="Times New Roman" w:hAnsi="Times New Roman" w:cs="Times New Roman"/>
-          <w:sz w:val="28"/>
-          <w:szCs w:val="28"/>
-        </w:rPr>
-        <w:t>3</w:t>
-      </w:r>
-      <w:r>
-        <w:rPr>
-          <w:rFonts w:ascii="Times New Roman" w:hAnsi="Times New Roman" w:cs="Times New Roman"/>
-          <w:sz w:val="28"/>
-          <w:szCs w:val="28"/>
-        </w:rPr>
-        <w:t>00,000 was transferred out of his account</w:t>
-      </w:r>
-      <w:r>
-        <w:rPr>
-          <w:rFonts w:ascii="Times New Roman" w:hAnsi="Times New Roman" w:cs="Times New Roman"/>
-          <w:sz w:val="28"/>
-          <w:szCs w:val="28"/>
-        </w:rPr>
-        <w:t xml:space="preserve"> the next day. The rest would soon follow</w:t>
-      </w:r>
-      <w:r>
-        <w:rPr>
-          <w:rFonts w:ascii="Times New Roman" w:hAnsi="Times New Roman" w:cs="Times New Roman"/>
-          <w:sz w:val="28"/>
-          <w:szCs w:val="28"/>
-        </w:rPr>
-        <w:t xml:space="preserve"> at the end of March.</w:t>
+        <w:t>Despite the exceptional foresight, Vivaldi007 did not continue to trade on the conflict. US$300,000 was transferred out of his account the next day. The rest would soon follow at the end of March.</w:t>
+      </w:r>
+      <w:r>
+        <w:rPr>
+          <w:rFonts w:ascii="Times New Roman" w:hAnsi="Times New Roman" w:cs="Times New Roman"/>
+          <w:sz w:val="28"/>
+          <w:szCs w:val="28"/>
+        </w:rPr>
+      </w:r>
+      <w:r>
+        <w:rPr>
+          <w:rFonts w:ascii="Times New Roman" w:hAnsi="Times New Roman" w:cs="Times New Roman"/>
+          <w:sz w:val="28"/>
+          <w:szCs w:val="28"/>
+        </w:rPr>
+      </w:r>
+      <w:r>
+        <w:rPr>
+          <w:rFonts w:ascii="Times New Roman" w:hAnsi="Times New Roman" w:cs="Times New Roman"/>
+          <w:sz w:val="28"/>
+          <w:szCs w:val="28"/>
+        </w:rPr>
+      </w:r>
+      <w:r>
+        <w:rPr>
+          <w:rFonts w:ascii="Times New Roman" w:hAnsi="Times New Roman" w:cs="Times New Roman"/>
+          <w:sz w:val="28"/>
+          <w:szCs w:val="28"/>
+        </w:rPr>
+      </w:r>
+      <w:r>
+        <w:rPr>
+          <w:rFonts w:ascii="Times New Roman" w:hAnsi="Times New Roman" w:cs="Times New Roman"/>
+          <w:sz w:val="28"/>
+          <w:szCs w:val="28"/>
+        </w:rPr>
+      </w:r>
+      <w:r>
+        <w:rPr>
+          <w:rFonts w:ascii="Times New Roman" w:hAnsi="Times New Roman" w:cs="Times New Roman"/>
+          <w:sz w:val="28"/>
+          <w:szCs w:val="28"/>
+        </w:rPr>
       </w:r>
     </w:p>
     <w:p>
@@ -652,7 +647,7 @@
           <w:sz w:val="28"/>
           <w:szCs w:val="28"/>
         </w:rPr>
-        <w:t>Vivaldi007 had placed its bets on Polymarket, an online exchange where users can buy and sell shares tied to the likelihood of future events.</w:t>
+        <w:t>Vivaldi007 had placed its bets on Polymarket, an online exchange where users can use crypto to buy and sell shares tied to the likelihood of future events.</w:t>
       </w:r>
     </w:p>
     <w:p>
@@ -1044,79 +1039,70 @@
           <w:sz w:val="28"/>
           <w:szCs w:val="28"/>
         </w:rPr>
-        <w:t>However, the</w:t>
-      </w:r>
-      <w:r>
-        <w:rPr>
-          <w:rFonts w:ascii="Times New Roman" w:hAnsi="Times New Roman" w:cs="Times New Roman"/>
-          <w:sz w:val="28"/>
-          <w:szCs w:val="28"/>
-        </w:rPr>
-        <w:t xml:space="preserve"> academic-minded</w:t>
-      </w:r>
-      <w:r>
-        <w:rPr>
-          <w:rFonts w:ascii="Times New Roman" w:hAnsi="Times New Roman" w:cs="Times New Roman"/>
-          <w:sz w:val="28"/>
-          <w:szCs w:val="28"/>
-        </w:rPr>
-        <w:t xml:space="preserve"> IEM </w:t>
-      </w:r>
-      <w:r>
-        <w:rPr>
-          <w:rFonts w:ascii="Times New Roman" w:hAnsi="Times New Roman" w:cs="Times New Roman"/>
-          <w:sz w:val="28"/>
-          <w:szCs w:val="28"/>
-        </w:rPr>
-        <w:t xml:space="preserve">has never captured the mainstream imagination. It is the surging popularity of </w:t>
-      </w:r>
-      <w:r>
-        <w:rPr>
-          <w:rFonts w:ascii="Times New Roman" w:hAnsi="Times New Roman" w:cs="Times New Roman"/>
-          <w:sz w:val="28"/>
-          <w:szCs w:val="28"/>
-        </w:rPr>
-        <w:t xml:space="preserve">commercial platforms like </w:t>
-      </w:r>
-      <w:r>
-        <w:rPr>
-          <w:rFonts w:ascii="Times New Roman" w:hAnsi="Times New Roman" w:cs="Times New Roman"/>
-          <w:sz w:val="28"/>
-          <w:szCs w:val="28"/>
-        </w:rPr>
-        <w:t xml:space="preserve">Kalshi and Polymarket that have brought prediction into public consciousness and controversy. </w:t>
-      </w:r>
-      <w:r>
-        <w:rPr>
-          <w:rFonts w:ascii="Times New Roman" w:hAnsi="Times New Roman" w:cs="Times New Roman"/>
-          <w:sz w:val="28"/>
-          <w:szCs w:val="28"/>
-        </w:rPr>
-        <w:t>The</w:t>
-      </w:r>
-      <w:r>
-        <w:rPr>
-          <w:rFonts w:ascii="Times New Roman" w:hAnsi="Times New Roman" w:cs="Times New Roman"/>
-          <w:sz w:val="28"/>
-          <w:szCs w:val="28"/>
-        </w:rPr>
-        <w:t xml:space="preserve"> companies </w:t>
-      </w:r>
-      <w:r>
-        <w:rPr>
-          <w:rFonts w:ascii="Times New Roman" w:hAnsi="Times New Roman" w:cs="Times New Roman"/>
-          <w:sz w:val="28"/>
-          <w:szCs w:val="28"/>
-        </w:rPr>
-        <w:t xml:space="preserve">have </w:t>
-      </w:r>
-      <w:r>
-        <w:rPr>
-          <w:rFonts w:ascii="Times New Roman" w:hAnsi="Times New Roman" w:cs="Times New Roman"/>
-          <w:sz w:val="28"/>
-          <w:szCs w:val="28"/>
-        </w:rPr>
-        <w:t>made billionaires of their young founders. They've also been accused of peddling addiction to a new generation of punters.</w:t>
+        <w:t>However, the academic-minded IEM has never captured the mainstream imagination. It is the surging popularity of commercial platforms like Kalshi and Polymarket that has brought prediction into public consciousness and controversy. The companies have made billionaires of their young founders. They've also been accused of peddling addiction to a new generation of punters.</w:t>
+      </w:r>
+      <w:r>
+        <w:rPr>
+          <w:rFonts w:ascii="Times New Roman" w:hAnsi="Times New Roman" w:cs="Times New Roman"/>
+          <w:sz w:val="28"/>
+          <w:szCs w:val="28"/>
+        </w:rPr>
+      </w:r>
+      <w:r>
+        <w:rPr>
+          <w:rFonts w:ascii="Times New Roman" w:hAnsi="Times New Roman" w:cs="Times New Roman"/>
+          <w:sz w:val="28"/>
+          <w:szCs w:val="28"/>
+        </w:rPr>
+      </w:r>
+      <w:r>
+        <w:rPr>
+          <w:rFonts w:ascii="Times New Roman" w:hAnsi="Times New Roman" w:cs="Times New Roman"/>
+          <w:sz w:val="28"/>
+          <w:szCs w:val="28"/>
+        </w:rPr>
+      </w:r>
+      <w:r>
+        <w:rPr>
+          <w:rFonts w:ascii="Times New Roman" w:hAnsi="Times New Roman" w:cs="Times New Roman"/>
+          <w:sz w:val="28"/>
+          <w:szCs w:val="28"/>
+        </w:rPr>
+      </w:r>
+      <w:r>
+        <w:rPr>
+          <w:rFonts w:ascii="Times New Roman" w:hAnsi="Times New Roman" w:cs="Times New Roman"/>
+          <w:sz w:val="28"/>
+          <w:szCs w:val="28"/>
+        </w:rPr>
+      </w:r>
+      <w:r>
+        <w:rPr>
+          <w:rFonts w:ascii="Times New Roman" w:hAnsi="Times New Roman" w:cs="Times New Roman"/>
+          <w:sz w:val="28"/>
+          <w:szCs w:val="28"/>
+        </w:rPr>
+      </w:r>
+      <w:r>
+        <w:rPr>
+          <w:rFonts w:ascii="Times New Roman" w:hAnsi="Times New Roman" w:cs="Times New Roman"/>
+          <w:sz w:val="28"/>
+          <w:szCs w:val="28"/>
+        </w:rPr>
+      </w:r>
+      <w:r>
+        <w:rPr>
+          <w:rFonts w:ascii="Times New Roman" w:hAnsi="Times New Roman" w:cs="Times New Roman"/>
+          <w:sz w:val="28"/>
+          <w:szCs w:val="28"/>
+        </w:rPr>
+      </w:r>
+      <w:r>
+        <w:rPr>
+          <w:rFonts w:ascii="Times New Roman" w:hAnsi="Times New Roman" w:cs="Times New Roman"/>
+          <w:sz w:val="28"/>
+          <w:szCs w:val="28"/>
+        </w:rPr>
       </w:r>
     </w:p>
     <w:p>
@@ -1168,7 +1154,7 @@
           <w:sz w:val="28"/>
           <w:szCs w:val="28"/>
         </w:rPr>
-        <w:t xml:space="preserve">"If we were flying through Dubai and the conflict kicks off </w:t>
+        <w:t>"If we were flying through Dubai and the conflict kicks off again, there's at least some value in knowing there's a 20% chance flights will be cancelled. That's important for a multi-billion dollar industry."</w:t>
       </w:r>
       <w:proofErr w:type="gramStart"/>
       <w:r>
@@ -1177,39 +1163,34 @@
           <w:sz w:val="28"/>
           <w:szCs w:val="28"/>
         </w:rPr>
-        <w:t>again</w:t>
-      </w:r>
-      <w:r>
-        <w:rPr>
-          <w:rFonts w:ascii="Times New Roman" w:hAnsi="Times New Roman" w:cs="Times New Roman"/>
-          <w:sz w:val="28"/>
-          <w:szCs w:val="28"/>
-        </w:rPr>
-        <w:t xml:space="preserve">, </w:t>
-      </w:r>
-      <w:r>
-        <w:rPr>
-          <w:rFonts w:ascii="Times New Roman" w:hAnsi="Times New Roman" w:cs="Times New Roman"/>
-          <w:sz w:val="28"/>
-          <w:szCs w:val="28"/>
-        </w:rPr>
-        <w:t xml:space="preserve"> </w:t>
-      </w:r>
-      <w:r>
-        <w:rPr>
-          <w:rFonts w:ascii="Times New Roman" w:hAnsi="Times New Roman" w:cs="Times New Roman"/>
-          <w:sz w:val="28"/>
-          <w:szCs w:val="28"/>
-        </w:rPr>
-        <w:t>t</w:t>
-      </w:r>
-      <w:r>
-        <w:rPr>
-          <w:rFonts w:ascii="Times New Roman" w:hAnsi="Times New Roman" w:cs="Times New Roman"/>
-          <w:sz w:val="28"/>
-          <w:szCs w:val="28"/>
-        </w:rPr>
-        <w:t>here's</w:t>
+      </w:r>
+      <w:r>
+        <w:rPr>
+          <w:rFonts w:ascii="Times New Roman" w:hAnsi="Times New Roman" w:cs="Times New Roman"/>
+          <w:sz w:val="28"/>
+          <w:szCs w:val="28"/>
+        </w:rPr>
+      </w:r>
+      <w:r>
+        <w:rPr>
+          <w:rFonts w:ascii="Times New Roman" w:hAnsi="Times New Roman" w:cs="Times New Roman"/>
+          <w:sz w:val="28"/>
+          <w:szCs w:val="28"/>
+        </w:rPr>
+      </w:r>
+      <w:r>
+        <w:rPr>
+          <w:rFonts w:ascii="Times New Roman" w:hAnsi="Times New Roman" w:cs="Times New Roman"/>
+          <w:sz w:val="28"/>
+          <w:szCs w:val="28"/>
+        </w:rPr>
+      </w:r>
+      <w:r>
+        <w:rPr>
+          <w:rFonts w:ascii="Times New Roman" w:hAnsi="Times New Roman" w:cs="Times New Roman"/>
+          <w:sz w:val="28"/>
+          <w:szCs w:val="28"/>
+        </w:rPr>
       </w:r>
       <w:proofErr w:type="gramEnd"/>
       <w:r>
@@ -1218,23 +1199,20 @@
           <w:sz w:val="28"/>
           <w:szCs w:val="28"/>
         </w:rPr>
-        <w:t xml:space="preserve"> at least some value in knowing there's a 20% chance flights will be cancelled</w:t>
-      </w:r>
-      <w:r>
-        <w:rPr>
-          <w:rFonts w:ascii="Times New Roman" w:hAnsi="Times New Roman" w:cs="Times New Roman"/>
-          <w:sz w:val="28"/>
-          <w:szCs w:val="28"/>
-        </w:rPr>
-        <w:t>. T</w:t>
-      </w:r>
-      <w:r>
-        <w:rPr>
-          <w:rFonts w:ascii="Times New Roman" w:hAnsi="Times New Roman" w:cs="Times New Roman"/>
-          <w:sz w:val="28"/>
-          <w:szCs w:val="28"/>
-        </w:rPr>
-        <w:t>hat's important for a multi-</w:t>
+      </w:r>
+      <w:r>
+        <w:rPr>
+          <w:rFonts w:ascii="Times New Roman" w:hAnsi="Times New Roman" w:cs="Times New Roman"/>
+          <w:sz w:val="28"/>
+          <w:szCs w:val="28"/>
+        </w:rPr>
+      </w:r>
+      <w:r>
+        <w:rPr>
+          <w:rFonts w:ascii="Times New Roman" w:hAnsi="Times New Roman" w:cs="Times New Roman"/>
+          <w:sz w:val="28"/>
+          <w:szCs w:val="28"/>
+        </w:rPr>
       </w:r>
       <w:proofErr w:type="gramStart"/>
       <w:r>
@@ -1243,7 +1221,6 @@
           <w:sz w:val="28"/>
           <w:szCs w:val="28"/>
         </w:rPr>
-        <w:t>billion dollar</w:t>
       </w:r>
       <w:proofErr w:type="gramEnd"/>
       <w:r>
@@ -1252,7 +1229,6 @@
           <w:sz w:val="28"/>
           <w:szCs w:val="28"/>
         </w:rPr>
-        <w:t xml:space="preserve"> industry."</w:t>
       </w:r>
     </w:p>
     <w:p>
@@ -1270,7 +1246,7 @@
           <w:sz w:val="28"/>
           <w:szCs w:val="28"/>
         </w:rPr>
-        <w:t>Jon Reiter, a former trader who now runs his own blockchain analytics firm, also recognises their value for decision-making. "Businesses need to be aware of upcoming business events like tax rates, and elections affect tax rates and tax rates affect what country you build your factory in," he said "it's kind of a simple example but it's real."</w:t>
+        <w:t>Jon Reiter, a former trader who now runs his own blockchain analytics firm, also recognises their value for decision-making. "Businesses need to be aware of upcoming business events like tax rates, and elections affect tax rates and tax rates affect what country you build your factory in," he said, "it's kind of a simple example but it's real."</w:t>
       </w:r>
     </w:p>
     <w:p>
@@ -1406,72 +1382,63 @@
           <w:sz w:val="28"/>
           <w:szCs w:val="28"/>
         </w:rPr>
-        <w:lastRenderedPageBreak/>
-        <w:t>Unfortunately, the structure of Polymarket—anonymity guaranteed</w:t>
-      </w:r>
-      <w:r>
-        <w:rPr>
-          <w:rFonts w:ascii="Times New Roman" w:hAnsi="Times New Roman" w:cs="Times New Roman"/>
-          <w:sz w:val="28"/>
-          <w:szCs w:val="28"/>
-        </w:rPr>
-        <w:t xml:space="preserve"> via the Polygon chain</w:t>
-      </w:r>
-      <w:r>
-        <w:rPr>
-          <w:rFonts w:ascii="Times New Roman" w:hAnsi="Times New Roman" w:cs="Times New Roman"/>
-          <w:sz w:val="28"/>
-          <w:szCs w:val="28"/>
-        </w:rPr>
-        <w:t xml:space="preserve">—makes it difficult to distinguish corruption from prediction. Since the start of 2026, four men have been arrested for trading on confidential information on Polymarket. They include a US special forces operator who traded on Maduro's capture, a Google engineer who </w:t>
-      </w:r>
-      <w:r>
-        <w:rPr>
-          <w:rFonts w:ascii="Times New Roman" w:hAnsi="Times New Roman" w:cs="Times New Roman"/>
-          <w:sz w:val="28"/>
-          <w:szCs w:val="28"/>
-        </w:rPr>
-        <w:t xml:space="preserve">cash in </w:t>
-      </w:r>
-      <w:r>
-        <w:rPr>
-          <w:rFonts w:ascii="Times New Roman" w:hAnsi="Times New Roman" w:cs="Times New Roman"/>
-          <w:sz w:val="28"/>
-          <w:szCs w:val="28"/>
-        </w:rPr>
-        <w:t xml:space="preserve">on the top search terms and two IDF officers </w:t>
-      </w:r>
-      <w:r>
-        <w:rPr>
-          <w:rFonts w:ascii="Times New Roman" w:hAnsi="Times New Roman" w:cs="Times New Roman"/>
-          <w:sz w:val="28"/>
-          <w:szCs w:val="28"/>
-        </w:rPr>
-        <w:t>with knowledge of</w:t>
-      </w:r>
-      <w:r>
-        <w:rPr>
-          <w:rFonts w:ascii="Times New Roman" w:hAnsi="Times New Roman" w:cs="Times New Roman"/>
-          <w:sz w:val="28"/>
-          <w:szCs w:val="28"/>
-        </w:rPr>
-        <w:t xml:space="preserve"> </w:t>
-      </w:r>
-      <w:r>
-        <w:rPr>
-          <w:rFonts w:ascii="Times New Roman" w:hAnsi="Times New Roman" w:cs="Times New Roman"/>
-          <w:sz w:val="28"/>
-          <w:szCs w:val="28"/>
-        </w:rPr>
-        <w:t>air</w:t>
-      </w:r>
-      <w:r>
-        <w:rPr>
-          <w:rFonts w:ascii="Times New Roman" w:hAnsi="Times New Roman" w:cs="Times New Roman"/>
-          <w:sz w:val="28"/>
-          <w:szCs w:val="28"/>
-        </w:rPr>
-        <w:t xml:space="preserve"> strikes in the Middle East.</w:t>
+        <w:t>Unfortunately, the structure of Polymarket—anonymity guaranteed via the Polygon chain—makes it difficult to distinguish corruption from prediction. Since the start of 2026, four men have been arrested for trading on confidential information on Polymarket. They include a US special forces operator who traded on Maduro's capture, a Google engineer who cashed in on the top search terms and two IDF officers with knowledge of air strikes in the Middle East.</w:t>
+      </w:r>
+      <w:r>
+        <w:rPr>
+          <w:rFonts w:ascii="Times New Roman" w:hAnsi="Times New Roman" w:cs="Times New Roman"/>
+          <w:sz w:val="28"/>
+          <w:szCs w:val="28"/>
+        </w:rPr>
+      </w:r>
+      <w:r>
+        <w:rPr>
+          <w:rFonts w:ascii="Times New Roman" w:hAnsi="Times New Roman" w:cs="Times New Roman"/>
+          <w:sz w:val="28"/>
+          <w:szCs w:val="28"/>
+        </w:rPr>
+      </w:r>
+      <w:r>
+        <w:rPr>
+          <w:rFonts w:ascii="Times New Roman" w:hAnsi="Times New Roman" w:cs="Times New Roman"/>
+          <w:sz w:val="28"/>
+          <w:szCs w:val="28"/>
+        </w:rPr>
+      </w:r>
+      <w:r>
+        <w:rPr>
+          <w:rFonts w:ascii="Times New Roman" w:hAnsi="Times New Roman" w:cs="Times New Roman"/>
+          <w:sz w:val="28"/>
+          <w:szCs w:val="28"/>
+        </w:rPr>
+      </w:r>
+      <w:r>
+        <w:rPr>
+          <w:rFonts w:ascii="Times New Roman" w:hAnsi="Times New Roman" w:cs="Times New Roman"/>
+          <w:sz w:val="28"/>
+          <w:szCs w:val="28"/>
+        </w:rPr>
+      </w:r>
+      <w:r>
+        <w:rPr>
+          <w:rFonts w:ascii="Times New Roman" w:hAnsi="Times New Roman" w:cs="Times New Roman"/>
+          <w:sz w:val="28"/>
+          <w:szCs w:val="28"/>
+        </w:rPr>
+      </w:r>
+      <w:r>
+        <w:rPr>
+          <w:rFonts w:ascii="Times New Roman" w:hAnsi="Times New Roman" w:cs="Times New Roman"/>
+          <w:sz w:val="28"/>
+          <w:szCs w:val="28"/>
+        </w:rPr>
+      </w:r>
+      <w:r>
+        <w:rPr>
+          <w:rFonts w:ascii="Times New Roman" w:hAnsi="Times New Roman" w:cs="Times New Roman"/>
+          <w:sz w:val="28"/>
+          <w:szCs w:val="28"/>
+        </w:rPr>
       </w:r>
     </w:p>
     <w:p>
@@ -1535,7 +1502,7 @@
           <w:sz w:val="28"/>
           <w:szCs w:val="28"/>
         </w:rPr>
-        <w:t>'Will the US Strike Iran by 28th February' was one of the most popular geopolitical markets. It attracted 218,033 transactions, from 22,939 unique wallets. The total volume traded was $USD89,652,867</w:t>
+        <w:t>'Will the US Strike Iran by 28th February' was one of the most popular geopolitical markets. It attracted 218,033 transactions, from 22,939 unique wallets. The total volume traded was US$89,652,867</w:t>
       </w:r>
     </w:p>
     <w:p>
@@ -1553,7 +1520,7 @@
           <w:sz w:val="28"/>
           <w:szCs w:val="28"/>
         </w:rPr>
-        <w:t>Long bets, defined as wagers of more than $2,500 and under the median price of $0.32 per share, were placed by just 255 wallets. At least 78 were fresh accounts which had no history before the war.</w:t>
+        <w:t>Long bets, defined as wagers of more than US$2,500 and under the median price of US$0.32 per share, were placed by just 255 wallets. At least 78 were fresh accounts which had no history before the war.</w:t>
       </w:r>
     </w:p>
     <w:p>
@@ -1571,31 +1538,28 @@
           <w:sz w:val="28"/>
           <w:szCs w:val="28"/>
         </w:rPr>
-        <w:t>During the last 12 hours before the strike, these</w:t>
-      </w:r>
-      <w:r>
-        <w:rPr>
-          <w:rFonts w:ascii="Times New Roman" w:hAnsi="Times New Roman" w:cs="Times New Roman"/>
-          <w:sz w:val="28"/>
-          <w:szCs w:val="28"/>
-        </w:rPr>
-        <w:t xml:space="preserve"> accounts</w:t>
-      </w:r>
-      <w:r>
-        <w:rPr>
-          <w:rFonts w:ascii="Times New Roman" w:hAnsi="Times New Roman" w:cs="Times New Roman"/>
-          <w:sz w:val="28"/>
-          <w:szCs w:val="28"/>
-        </w:rPr>
-        <w:t xml:space="preserve"> made a total of $1.7 million—approximately a third of all profits made during the time </w:t>
-      </w:r>
-      <w:r>
-        <w:rPr>
-          <w:rFonts w:ascii="Times New Roman" w:hAnsi="Times New Roman" w:cs="Times New Roman"/>
-          <w:sz w:val="28"/>
-          <w:szCs w:val="28"/>
-        </w:rPr>
-        <w:t>span.</w:t>
+        <w:t>During the last 12 hours before the strike, these accounts made a total of US$1.7 million—approximately a third of all profits made during the time span.</w:t>
+      </w:r>
+      <w:r>
+        <w:rPr>
+          <w:rFonts w:ascii="Times New Roman" w:hAnsi="Times New Roman" w:cs="Times New Roman"/>
+          <w:sz w:val="28"/>
+          <w:szCs w:val="28"/>
+        </w:rPr>
+      </w:r>
+      <w:r>
+        <w:rPr>
+          <w:rFonts w:ascii="Times New Roman" w:hAnsi="Times New Roman" w:cs="Times New Roman"/>
+          <w:sz w:val="28"/>
+          <w:szCs w:val="28"/>
+        </w:rPr>
+      </w:r>
+      <w:r>
+        <w:rPr>
+          <w:rFonts w:ascii="Times New Roman" w:hAnsi="Times New Roman" w:cs="Times New Roman"/>
+          <w:sz w:val="28"/>
+          <w:szCs w:val="28"/>
+        </w:rPr>
       </w:r>
     </w:p>
     <w:p>
@@ -1631,39 +1595,35 @@
           <w:sz w:val="28"/>
           <w:szCs w:val="28"/>
         </w:rPr>
-        <w:t>By 9AM, its $18,700 investment would be worth $98,700-a nearly 500% return</w:t>
-      </w:r>
-      <w:r>
-        <w:rPr>
-          <w:rFonts w:ascii="Times New Roman" w:hAnsi="Times New Roman" w:cs="Times New Roman"/>
-          <w:sz w:val="28"/>
-          <w:szCs w:val="28"/>
-        </w:rPr>
-        <w:t xml:space="preserve"> on investment</w:t>
-      </w:r>
-      <w:r>
-        <w:rPr>
-          <w:rFonts w:ascii="Times New Roman" w:hAnsi="Times New Roman" w:cs="Times New Roman"/>
-          <w:sz w:val="28"/>
-          <w:szCs w:val="28"/>
-        </w:rPr>
-        <w:t xml:space="preserve">. It cashed out </w:t>
-      </w:r>
-      <w:r>
-        <w:rPr>
-          <w:rFonts w:ascii="Times New Roman" w:hAnsi="Times New Roman" w:cs="Times New Roman"/>
-          <w:sz w:val="28"/>
-          <w:szCs w:val="28"/>
-        </w:rPr>
-        <w:t>all</w:t>
-      </w:r>
-      <w:r>
-        <w:rPr>
-          <w:rFonts w:ascii="Times New Roman" w:hAnsi="Times New Roman" w:cs="Times New Roman"/>
-          <w:sz w:val="28"/>
-          <w:szCs w:val="28"/>
-        </w:rPr>
-        <w:t xml:space="preserve"> its profits between 18:30 - 19:22pm on the same day, before deleting the account.</w:t>
+        <w:t>By 9AM, its US$18,700 investment would be worth US$98,700-a nearly 500% return on investment. It cashed out all its profits between 18:30 - 19:22PM on the same day, before deleting the account.</w:t>
+      </w:r>
+      <w:r>
+        <w:rPr>
+          <w:rFonts w:ascii="Times New Roman" w:hAnsi="Times New Roman" w:cs="Times New Roman"/>
+          <w:sz w:val="28"/>
+          <w:szCs w:val="28"/>
+        </w:rPr>
+      </w:r>
+      <w:r>
+        <w:rPr>
+          <w:rFonts w:ascii="Times New Roman" w:hAnsi="Times New Roman" w:cs="Times New Roman"/>
+          <w:sz w:val="28"/>
+          <w:szCs w:val="28"/>
+        </w:rPr>
+      </w:r>
+      <w:r>
+        <w:rPr>
+          <w:rFonts w:ascii="Times New Roman" w:hAnsi="Times New Roman" w:cs="Times New Roman"/>
+          <w:sz w:val="28"/>
+          <w:szCs w:val="28"/>
+        </w:rPr>
+      </w:r>
+      <w:r>
+        <w:rPr>
+          <w:rFonts w:ascii="Times New Roman" w:hAnsi="Times New Roman" w:cs="Times New Roman"/>
+          <w:sz w:val="28"/>
+          <w:szCs w:val="28"/>
+        </w:rPr>
       </w:r>
     </w:p>
     <w:p>
@@ -1681,7 +1641,7 @@
           <w:sz w:val="28"/>
           <w:szCs w:val="28"/>
         </w:rPr>
-        <w:t xml:space="preserve">Another user flagged for suspicious activity is Dicedicedice. Between 1-2 AM on the morning of the </w:t>
+        <w:t>Another user flagged for suspicious activity is Dicedicedice. Between 1-2 AM on the morning of the 28th February, the account bought 149,995 YES Shares at US$0.20 per share.</w:t>
       </w:r>
       <w:proofErr w:type="gramStart"/>
       <w:r>
@@ -1690,7 +1650,6 @@
           <w:sz w:val="28"/>
           <w:szCs w:val="28"/>
         </w:rPr>
-        <w:t>28th</w:t>
       </w:r>
       <w:proofErr w:type="gramEnd"/>
       <w:r>
@@ -1699,7 +1658,6 @@
           <w:sz w:val="28"/>
           <w:szCs w:val="28"/>
         </w:rPr>
-        <w:t xml:space="preserve"> February, the account bought 149,995 YES Shares at $0.20 per share.</w:t>
       </w:r>
     </w:p>
     <w:p>
@@ -1717,24 +1675,21 @@
           <w:sz w:val="28"/>
           <w:szCs w:val="28"/>
         </w:rPr>
-        <w:lastRenderedPageBreak/>
-        <w:t xml:space="preserve">Just like 0x45647, </w:t>
-      </w:r>
-      <w:r>
-        <w:rPr>
-          <w:rFonts w:ascii="Times New Roman" w:hAnsi="Times New Roman" w:cs="Times New Roman"/>
-          <w:sz w:val="28"/>
-          <w:szCs w:val="28"/>
-        </w:rPr>
-        <w:t>it would disappear after making a windfall. The account</w:t>
-      </w:r>
-      <w:r>
-        <w:rPr>
-          <w:rFonts w:ascii="Times New Roman" w:hAnsi="Times New Roman" w:cs="Times New Roman"/>
-          <w:sz w:val="28"/>
-          <w:szCs w:val="28"/>
-        </w:rPr>
-        <w:t xml:space="preserve"> made $119,963 dollars and cashed out at 4:17pm on the same day.</w:t>
+        <w:t>Just like 0x45647, it would disappear after making a windfall. The account made US$119,963 dollars and cashed out at 4:17pm on the same day.</w:t>
+      </w:r>
+      <w:r>
+        <w:rPr>
+          <w:rFonts w:ascii="Times New Roman" w:hAnsi="Times New Roman" w:cs="Times New Roman"/>
+          <w:sz w:val="28"/>
+          <w:szCs w:val="28"/>
+        </w:rPr>
+      </w:r>
+      <w:r>
+        <w:rPr>
+          <w:rFonts w:ascii="Times New Roman" w:hAnsi="Times New Roman" w:cs="Times New Roman"/>
+          <w:sz w:val="28"/>
+          <w:szCs w:val="28"/>
+        </w:rPr>
       </w:r>
     </w:p>
     <w:p>
@@ -1880,23 +1835,21 @@
           <w:sz w:val="28"/>
           <w:szCs w:val="28"/>
         </w:rPr>
-        <w:t>Djijaij83jdo4jdlwjflsg follows a similiar pattern. It joined Polymarket on 28th February, funded itself at 00:56</w:t>
-      </w:r>
-      <w:r>
-        <w:rPr>
-          <w:rFonts w:ascii="Times New Roman" w:hAnsi="Times New Roman" w:cs="Times New Roman"/>
-          <w:sz w:val="28"/>
-          <w:szCs w:val="28"/>
-        </w:rPr>
-        <w:t xml:space="preserve"> </w:t>
-      </w:r>
-      <w:r>
-        <w:rPr>
-          <w:rFonts w:ascii="Times New Roman" w:hAnsi="Times New Roman" w:cs="Times New Roman"/>
-          <w:sz w:val="28"/>
-          <w:szCs w:val="28"/>
-        </w:rPr>
-        <w:t>AM and won $32,399.99 (426.32%) by the day's end</w:t>
+        <w:t>Djijaij83jdo4jdlwjflsg followed a similar pattern. It joined Polymarket on 28th February, funded itself at 00:56 AM and won US$32,399.99 by the day's end</w:t>
+      </w:r>
+      <w:r>
+        <w:rPr>
+          <w:rFonts w:ascii="Times New Roman" w:hAnsi="Times New Roman" w:cs="Times New Roman"/>
+          <w:sz w:val="28"/>
+          <w:szCs w:val="28"/>
+        </w:rPr>
+      </w:r>
+      <w:r>
+        <w:rPr>
+          <w:rFonts w:ascii="Times New Roman" w:hAnsi="Times New Roman" w:cs="Times New Roman"/>
+          <w:sz w:val="28"/>
+          <w:szCs w:val="28"/>
+        </w:rPr>
       </w:r>
     </w:p>
     <w:p>
@@ -1914,7 +1867,7 @@
           <w:sz w:val="28"/>
           <w:szCs w:val="28"/>
         </w:rPr>
-        <w:t>Several of the accounts on Polymarket are also closely coordinated and connected to the same network.</w:t>
+        <w:t>Several of the accounts on Polymarket are also closely connected to the same source of funding.</w:t>
       </w:r>
     </w:p>
     <w:p>
@@ -1932,7 +1885,7 @@
           <w:sz w:val="28"/>
           <w:szCs w:val="28"/>
         </w:rPr>
-        <w:t>@aaamsaasa and @semiconductorIT made bets within 20 minutes of each other at 5:08AM and 5:27AM respectively. After winning $30,157.58 and $29,410.12 respectively, they would also withdraw their money at the same time.</w:t>
+        <w:t>@Aaamsaasa and @semiconductorIT made bets within 20 minutes of each other at 5:08AM and 5:27AM respectively. After winning US$30,157.58 and US$29,410.12 respectively, they would also withdraw their money at the same time.</w:t>
       </w:r>
     </w:p>
     <w:p>
@@ -1950,7 +1903,7 @@
           <w:sz w:val="28"/>
           <w:szCs w:val="28"/>
         </w:rPr>
-        <w:t xml:space="preserve">At 16:15pm and 16:20pm, they cashed </w:t>
+        <w:t>At 16:15pm and 16:20pm, they cashed out a large portion of their winnings to the same Solana wallet: 4dlzqynk9szjf6.</w:t>
       </w:r>
       <w:proofErr w:type="gramStart"/>
       <w:r>
@@ -1959,15 +1912,13 @@
           <w:sz w:val="28"/>
           <w:szCs w:val="28"/>
         </w:rPr>
-        <w:t xml:space="preserve">out </w:t>
-      </w:r>
-      <w:r>
-        <w:rPr>
-          <w:rFonts w:ascii="Times New Roman" w:hAnsi="Times New Roman" w:cs="Times New Roman"/>
-          <w:sz w:val="28"/>
-          <w:szCs w:val="28"/>
-        </w:rPr>
-        <w:t xml:space="preserve"> a</w:t>
+      </w:r>
+      <w:r>
+        <w:rPr>
+          <w:rFonts w:ascii="Times New Roman" w:hAnsi="Times New Roman" w:cs="Times New Roman"/>
+          <w:sz w:val="28"/>
+          <w:szCs w:val="28"/>
+        </w:rPr>
       </w:r>
       <w:proofErr w:type="gramEnd"/>
       <w:r>
@@ -1976,15 +1927,13 @@
           <w:sz w:val="28"/>
           <w:szCs w:val="28"/>
         </w:rPr>
-        <w:t xml:space="preserve"> large portion of </w:t>
-      </w:r>
-      <w:r>
-        <w:rPr>
-          <w:rFonts w:ascii="Times New Roman" w:hAnsi="Times New Roman" w:cs="Times New Roman"/>
-          <w:sz w:val="28"/>
-          <w:szCs w:val="28"/>
-        </w:rPr>
-        <w:t xml:space="preserve">their winnings to the same Solana wallet: 4dlzqynk9szjf6. </w:t>
+      </w:r>
+      <w:r>
+        <w:rPr>
+          <w:rFonts w:ascii="Times New Roman" w:hAnsi="Times New Roman" w:cs="Times New Roman"/>
+          <w:sz w:val="28"/>
+          <w:szCs w:val="28"/>
+        </w:rPr>
       </w:r>
     </w:p>
     <w:p>
@@ -2022,39 +1971,35 @@
           <w:sz w:val="28"/>
           <w:szCs w:val="28"/>
         </w:rPr>
-        <w:t>The anonymity of on</w:t>
-      </w:r>
-      <w:r>
-        <w:rPr>
-          <w:rFonts w:ascii="Times New Roman" w:hAnsi="Times New Roman" w:cs="Times New Roman"/>
-          <w:sz w:val="28"/>
-          <w:szCs w:val="28"/>
-        </w:rPr>
-        <w:t>-</w:t>
-      </w:r>
-      <w:r>
-        <w:rPr>
-          <w:rFonts w:ascii="Times New Roman" w:hAnsi="Times New Roman" w:cs="Times New Roman"/>
-          <w:sz w:val="28"/>
-          <w:szCs w:val="28"/>
-        </w:rPr>
-        <w:t xml:space="preserve">chain transactions </w:t>
-      </w:r>
-      <w:r>
-        <w:rPr>
-          <w:rFonts w:ascii="Times New Roman" w:hAnsi="Times New Roman" w:cs="Times New Roman"/>
-          <w:sz w:val="28"/>
-          <w:szCs w:val="28"/>
-        </w:rPr>
-        <w:t>makes</w:t>
-      </w:r>
-      <w:r>
-        <w:rPr>
-          <w:rFonts w:ascii="Times New Roman" w:hAnsi="Times New Roman" w:cs="Times New Roman"/>
-          <w:sz w:val="28"/>
-          <w:szCs w:val="28"/>
-        </w:rPr>
-        <w:t xml:space="preserve"> it difficult to ascertain a true insider, but the pattern of suspicious behaviour is equally difficult to dismiss. 64 of the 78 wallets highlighted by BLOCKHEAD Research were less than 2 months old. 71 of them have been completely inactive since their wins on the 28th of February.</w:t>
+        <w:t>The anonymity of on-chain transactions makes it difficult to ascertain which trades were made by true insiders, but the pattern of suspicious behaviour is equally difficult to dismiss. 64 of the 78 wallets highlighted by BLOCKHEAD Research were less than 2 months old. 71 of them have been completely inactive since their wins on the 28th of February.</w:t>
+      </w:r>
+      <w:r>
+        <w:rPr>
+          <w:rFonts w:ascii="Times New Roman" w:hAnsi="Times New Roman" w:cs="Times New Roman"/>
+          <w:sz w:val="28"/>
+          <w:szCs w:val="28"/>
+        </w:rPr>
+      </w:r>
+      <w:r>
+        <w:rPr>
+          <w:rFonts w:ascii="Times New Roman" w:hAnsi="Times New Roman" w:cs="Times New Roman"/>
+          <w:sz w:val="28"/>
+          <w:szCs w:val="28"/>
+        </w:rPr>
+      </w:r>
+      <w:r>
+        <w:rPr>
+          <w:rFonts w:ascii="Times New Roman" w:hAnsi="Times New Roman" w:cs="Times New Roman"/>
+          <w:sz w:val="28"/>
+          <w:szCs w:val="28"/>
+        </w:rPr>
+      </w:r>
+      <w:r>
+        <w:rPr>
+          <w:rFonts w:ascii="Times New Roman" w:hAnsi="Times New Roman" w:cs="Times New Roman"/>
+          <w:sz w:val="28"/>
+          <w:szCs w:val="28"/>
+        </w:rPr>
       </w:r>
     </w:p>
     <w:p>
@@ -2072,7 +2017,7 @@
           <w:sz w:val="28"/>
           <w:szCs w:val="28"/>
         </w:rPr>
-        <w:t>At least 6 of the Polymarket acccounts have been deleted at the time of writing. Their display names are now listed as 'anon'—the default assigned to deleted wallets.</w:t>
+        <w:t>At least 6 of the Polymarket accounts have been deleted at the time of writing. Their display names are now listed as 'anon'—the default assigned to deleted wallets.</w:t>
       </w:r>
     </w:p>
     <w:p>
@@ -2127,7 +2072,7 @@
           <w:sz w:val="28"/>
           <w:szCs w:val="28"/>
         </w:rPr>
-        <w:t>Unusual trading patterns were also observed in the several geopolitical markets on that fateful morning. Blockhead Research analysed the flow of liquidity in the last six hours before the start of the Iran war. In three separate markets related to the Iran war, trading spiked sharply between 5-6 AM UTC, just one hour before the strikes were launched and the war became public knowledge.</w:t>
+        <w:t>Unusual trading patterns were also observed in several geopolitical markets on that fateful morning. Blockhead Research analysed the flow of liquidity in the last six hours before the start of the Iran war. In three separate markets related to the Iran war, trading spiked sharply between 5-6 AM UTC, just one hour before the strikes were launched and the war became public knowledge.</w:t>
       </w:r>
     </w:p>
     <w:p>
@@ -2145,23 +2090,21 @@
           <w:sz w:val="28"/>
           <w:szCs w:val="28"/>
         </w:rPr>
-        <w:t xml:space="preserve">The spike was highly directional. Most of the traffic came from users buying YES shares for 'Will the US Strike Iran by 28th February?", "Will the US Strike Iran by 31 March?" and "Will the US next strike Iran on February 28, 2026 (ET)?". There was corresponding spike in </w:t>
-      </w:r>
-      <w:r>
-        <w:rPr>
-          <w:rFonts w:ascii="Times New Roman" w:hAnsi="Times New Roman" w:cs="Times New Roman"/>
-          <w:sz w:val="28"/>
-          <w:szCs w:val="28"/>
-        </w:rPr>
-        <w:t>demand</w:t>
-      </w:r>
-      <w:r>
-        <w:rPr>
-          <w:rFonts w:ascii="Times New Roman" w:hAnsi="Times New Roman" w:cs="Times New Roman"/>
-          <w:sz w:val="28"/>
-          <w:szCs w:val="28"/>
-        </w:rPr>
-        <w:t xml:space="preserve"> for NO shares.</w:t>
+        <w:t>The spike was highly directional. Most of the traffic came from users buying YES shares for 'Will the US Strike Iran by 28th February?", "Will the US Strike Iran by 31 March?" and "Will the US next strike Iran on February 28, 2026 (ET)?". There was a corresponding spike in demand for NO shares.</w:t>
+      </w:r>
+      <w:r>
+        <w:rPr>
+          <w:rFonts w:ascii="Times New Roman" w:hAnsi="Times New Roman" w:cs="Times New Roman"/>
+          <w:sz w:val="28"/>
+          <w:szCs w:val="28"/>
+        </w:rPr>
+      </w:r>
+      <w:r>
+        <w:rPr>
+          <w:rFonts w:ascii="Times New Roman" w:hAnsi="Times New Roman" w:cs="Times New Roman"/>
+          <w:sz w:val="28"/>
+          <w:szCs w:val="28"/>
+        </w:rPr>
       </w:r>
     </w:p>
     <w:p>
@@ -2228,7 +2171,7 @@
           <w:sz w:val="28"/>
           <w:szCs w:val="28"/>
         </w:rPr>
-        <w:t>For 'Will the US Strike Iran by 28th February', there were five times as many YES shares bought between 5-6 AM than in the previous hour. The sudden surge in demand drove the price upwards from $0.15 per share to $0.25 per share by 6AM.</w:t>
+        <w:t>For 'Will the US Strike Iran by 28th February', there were five times as many YES shares bought between 5-6 AM than in the previous hour. The sudden surge in demand drove the price upwards from US$0.15 per share to $0.25 per share by 6AM.</w:t>
       </w:r>
     </w:p>
     <w:p>
@@ -2246,31 +2189,28 @@
           <w:sz w:val="28"/>
           <w:szCs w:val="28"/>
         </w:rPr>
-        <w:t xml:space="preserve">Accounting for the mystery of this 5AM surge </w:t>
-      </w:r>
-      <w:r>
-        <w:rPr>
-          <w:rFonts w:ascii="Times New Roman" w:hAnsi="Times New Roman" w:cs="Times New Roman"/>
-          <w:sz w:val="28"/>
-          <w:szCs w:val="28"/>
-        </w:rPr>
-        <w:t>has proven</w:t>
-      </w:r>
-      <w:r>
-        <w:rPr>
-          <w:rFonts w:ascii="Times New Roman" w:hAnsi="Times New Roman" w:cs="Times New Roman"/>
-          <w:sz w:val="28"/>
-          <w:szCs w:val="28"/>
-        </w:rPr>
-        <w:t xml:space="preserve"> difficult. Mantic AI, a leading AI forecasting lab based in Oxfordshire, failed to pick up on the pre-strike signals which informed Polymarket traders. According to its Iran report, the first indications of conflict originating from market signals came at 6:17AM—2 minutes after the strikes </w:t>
-      </w:r>
-      <w:r>
-        <w:rPr>
-          <w:rFonts w:ascii="Times New Roman" w:hAnsi="Times New Roman" w:cs="Times New Roman"/>
-          <w:sz w:val="28"/>
-          <w:szCs w:val="28"/>
-        </w:rPr>
-        <w:t>began,</w:t>
+        <w:t>Accounting for the mystery of this 5AM surge has proven difficult. Mantic AI, a leading AI forecasting lab based in Oxfordshire, failed to pick up on the pre-strike signals which informed Polymarket traders. According to its Iran report, the first indications of conflict originating from market signals came at 6:17AM—2 minutes after the strikes began.</w:t>
+      </w:r>
+      <w:r>
+        <w:rPr>
+          <w:rFonts w:ascii="Times New Roman" w:hAnsi="Times New Roman" w:cs="Times New Roman"/>
+          <w:sz w:val="28"/>
+          <w:szCs w:val="28"/>
+        </w:rPr>
+      </w:r>
+      <w:r>
+        <w:rPr>
+          <w:rFonts w:ascii="Times New Roman" w:hAnsi="Times New Roman" w:cs="Times New Roman"/>
+          <w:sz w:val="28"/>
+          <w:szCs w:val="28"/>
+        </w:rPr>
+      </w:r>
+      <w:r>
+        <w:rPr>
+          <w:rFonts w:ascii="Times New Roman" w:hAnsi="Times New Roman" w:cs="Times New Roman"/>
+          <w:sz w:val="28"/>
+          <w:szCs w:val="28"/>
+        </w:rPr>
       </w:r>
     </w:p>
     <w:p>
@@ -2288,63 +2228,56 @@
           <w:sz w:val="28"/>
           <w:szCs w:val="28"/>
         </w:rPr>
-        <w:t xml:space="preserve">Hannah Su, a freelance shipping analyst, has examined the AIS transponder data from the US Aircraft Carriers involved in the war. </w:t>
-      </w:r>
-      <w:r>
-        <w:rPr>
-          <w:rFonts w:ascii="Times New Roman" w:hAnsi="Times New Roman" w:cs="Times New Roman"/>
-          <w:sz w:val="28"/>
-          <w:szCs w:val="28"/>
-        </w:rPr>
-        <w:t>S</w:t>
-      </w:r>
-      <w:r>
-        <w:rPr>
-          <w:rFonts w:ascii="Times New Roman" w:hAnsi="Times New Roman" w:cs="Times New Roman"/>
-          <w:sz w:val="28"/>
-          <w:szCs w:val="28"/>
-        </w:rPr>
-        <w:t>he says there is little open</w:t>
-      </w:r>
-      <w:r>
-        <w:rPr>
-          <w:rFonts w:ascii="Times New Roman" w:hAnsi="Times New Roman" w:cs="Times New Roman"/>
-          <w:sz w:val="28"/>
-          <w:szCs w:val="28"/>
-        </w:rPr>
-        <w:t>-</w:t>
-      </w:r>
-      <w:r>
-        <w:rPr>
-          <w:rFonts w:ascii="Times New Roman" w:hAnsi="Times New Roman" w:cs="Times New Roman"/>
-          <w:sz w:val="28"/>
-          <w:szCs w:val="28"/>
-        </w:rPr>
-        <w:t>source information</w:t>
-      </w:r>
-      <w:r>
-        <w:rPr>
-          <w:rFonts w:ascii="Times New Roman" w:hAnsi="Times New Roman" w:cs="Times New Roman"/>
-          <w:sz w:val="28"/>
-          <w:szCs w:val="28"/>
-        </w:rPr>
-        <w:t xml:space="preserve"> </w:t>
-      </w:r>
-      <w:r>
-        <w:rPr>
-          <w:rFonts w:ascii="Times New Roman" w:hAnsi="Times New Roman" w:cs="Times New Roman"/>
-          <w:sz w:val="28"/>
-          <w:szCs w:val="28"/>
-        </w:rPr>
-        <w:t xml:space="preserve">to suggest that </w:t>
-      </w:r>
-      <w:r>
-        <w:rPr>
-          <w:rFonts w:ascii="Times New Roman" w:hAnsi="Times New Roman" w:cs="Times New Roman"/>
-          <w:sz w:val="28"/>
-          <w:szCs w:val="28"/>
-        </w:rPr>
-        <w:t xml:space="preserve">an imminent strike. </w:t>
+        <w:t>Hannah Su, a freelance shipping analyst, has examined the location of the US Aircraft Carriers involved in the war. She says there is little open-source information to suggest that a strike was imminent.</w:t>
+      </w:r>
+      <w:r>
+        <w:rPr>
+          <w:rFonts w:ascii="Times New Roman" w:hAnsi="Times New Roman" w:cs="Times New Roman"/>
+          <w:sz w:val="28"/>
+          <w:szCs w:val="28"/>
+        </w:rPr>
+      </w:r>
+      <w:r>
+        <w:rPr>
+          <w:rFonts w:ascii="Times New Roman" w:hAnsi="Times New Roman" w:cs="Times New Roman"/>
+          <w:sz w:val="28"/>
+          <w:szCs w:val="28"/>
+        </w:rPr>
+      </w:r>
+      <w:r>
+        <w:rPr>
+          <w:rFonts w:ascii="Times New Roman" w:hAnsi="Times New Roman" w:cs="Times New Roman"/>
+          <w:sz w:val="28"/>
+          <w:szCs w:val="28"/>
+        </w:rPr>
+      </w:r>
+      <w:r>
+        <w:rPr>
+          <w:rFonts w:ascii="Times New Roman" w:hAnsi="Times New Roman" w:cs="Times New Roman"/>
+          <w:sz w:val="28"/>
+          <w:szCs w:val="28"/>
+        </w:rPr>
+      </w:r>
+      <w:r>
+        <w:rPr>
+          <w:rFonts w:ascii="Times New Roman" w:hAnsi="Times New Roman" w:cs="Times New Roman"/>
+          <w:sz w:val="28"/>
+          <w:szCs w:val="28"/>
+        </w:rPr>
+      </w:r>
+      <w:r>
+        <w:rPr>
+          <w:rFonts w:ascii="Times New Roman" w:hAnsi="Times New Roman" w:cs="Times New Roman"/>
+          <w:sz w:val="28"/>
+          <w:szCs w:val="28"/>
+        </w:rPr>
+      </w:r>
+      <w:r>
+        <w:rPr>
+          <w:rFonts w:ascii="Times New Roman" w:hAnsi="Times New Roman" w:cs="Times New Roman"/>
+          <w:sz w:val="28"/>
+          <w:szCs w:val="28"/>
+        </w:rPr>
       </w:r>
     </w:p>
     <w:p>
@@ -2545,47 +2478,42 @@
           <w:sz w:val="28"/>
           <w:szCs w:val="28"/>
         </w:rPr>
-        <w:t xml:space="preserve">Data scraped from X and discord also proved to be inconclusive. Previous spikes in trading had been </w:t>
-      </w:r>
-      <w:r>
-        <w:rPr>
-          <w:rFonts w:ascii="Times New Roman" w:hAnsi="Times New Roman" w:cs="Times New Roman"/>
-          <w:sz w:val="28"/>
-          <w:szCs w:val="28"/>
-        </w:rPr>
-        <w:t xml:space="preserve">plausibly </w:t>
-      </w:r>
-      <w:r>
-        <w:rPr>
-          <w:rFonts w:ascii="Times New Roman" w:hAnsi="Times New Roman" w:cs="Times New Roman"/>
-          <w:sz w:val="28"/>
-          <w:szCs w:val="28"/>
-        </w:rPr>
-        <w:t xml:space="preserve">linked to news reports from BBC Verify or </w:t>
-      </w:r>
-      <w:r>
-        <w:rPr>
-          <w:rFonts w:ascii="Times New Roman" w:hAnsi="Times New Roman" w:cs="Times New Roman"/>
-          <w:sz w:val="28"/>
-          <w:szCs w:val="28"/>
-        </w:rPr>
-        <w:t xml:space="preserve">Reuters Fact Check, but the pre-strike surge seem entirely random. No new information had emerged to motivate the frenzied </w:t>
-      </w:r>
-      <w:r>
-        <w:rPr>
-          <w:rFonts w:ascii="Times New Roman" w:hAnsi="Times New Roman" w:cs="Times New Roman"/>
-          <w:sz w:val="28"/>
-          <w:szCs w:val="28"/>
-        </w:rPr>
-        <w:t xml:space="preserve">pre-dawn </w:t>
-      </w:r>
-      <w:r>
-        <w:rPr>
-          <w:rFonts w:ascii="Times New Roman" w:hAnsi="Times New Roman" w:cs="Times New Roman"/>
-          <w:sz w:val="28"/>
-          <w:szCs w:val="28"/>
-        </w:rPr>
-        <w:t>buying.</w:t>
+        <w:t>Data scraped from X and Discord also proved to be inconclusive. Previous spikes in trading had been plausibly linked to news reports from BBC Verify or Reuters Fact Check, but the pre-strike surge seemed entirely random. No new information had emerged to motivate the frenzied pre-dawn buying.</w:t>
+      </w:r>
+      <w:r>
+        <w:rPr>
+          <w:rFonts w:ascii="Times New Roman" w:hAnsi="Times New Roman" w:cs="Times New Roman"/>
+          <w:sz w:val="28"/>
+          <w:szCs w:val="28"/>
+        </w:rPr>
+      </w:r>
+      <w:r>
+        <w:rPr>
+          <w:rFonts w:ascii="Times New Roman" w:hAnsi="Times New Roman" w:cs="Times New Roman"/>
+          <w:sz w:val="28"/>
+          <w:szCs w:val="28"/>
+        </w:rPr>
+      </w:r>
+      <w:r>
+        <w:rPr>
+          <w:rFonts w:ascii="Times New Roman" w:hAnsi="Times New Roman" w:cs="Times New Roman"/>
+          <w:sz w:val="28"/>
+          <w:szCs w:val="28"/>
+        </w:rPr>
+      </w:r>
+      <w:r>
+        <w:rPr>
+          <w:rFonts w:ascii="Times New Roman" w:hAnsi="Times New Roman" w:cs="Times New Roman"/>
+          <w:sz w:val="28"/>
+          <w:szCs w:val="28"/>
+        </w:rPr>
+      </w:r>
+      <w:r>
+        <w:rPr>
+          <w:rFonts w:ascii="Times New Roman" w:hAnsi="Times New Roman" w:cs="Times New Roman"/>
+          <w:sz w:val="28"/>
+          <w:szCs w:val="28"/>
+        </w:rPr>
       </w:r>
     </w:p>
     <w:p>
@@ -2691,87 +2619,77 @@
           <w:sz w:val="28"/>
           <w:szCs w:val="28"/>
         </w:rPr>
-        <w:t>In</w:t>
-      </w:r>
-      <w:r>
-        <w:rPr>
-          <w:rFonts w:ascii="Times New Roman" w:hAnsi="Times New Roman" w:cs="Times New Roman"/>
-          <w:sz w:val="28"/>
-          <w:szCs w:val="28"/>
-        </w:rPr>
-        <w:t xml:space="preserve"> more</w:t>
-      </w:r>
-      <w:r>
-        <w:rPr>
-          <w:rFonts w:ascii="Times New Roman" w:hAnsi="Times New Roman" w:cs="Times New Roman"/>
-          <w:sz w:val="28"/>
-          <w:szCs w:val="28"/>
-        </w:rPr>
-        <w:t xml:space="preserve"> recent months, the companies have changed their tune. The intense media scrutiny seemed to have spurred </w:t>
-      </w:r>
-      <w:r>
-        <w:rPr>
-          <w:rFonts w:ascii="Times New Roman" w:hAnsi="Times New Roman" w:cs="Times New Roman"/>
-          <w:sz w:val="28"/>
-          <w:szCs w:val="28"/>
-        </w:rPr>
-        <w:t>a</w:t>
-      </w:r>
-      <w:r>
-        <w:rPr>
-          <w:rFonts w:ascii="Times New Roman" w:hAnsi="Times New Roman" w:cs="Times New Roman"/>
-          <w:sz w:val="28"/>
-          <w:szCs w:val="28"/>
-        </w:rPr>
-        <w:t xml:space="preserve"> policy reversal on the use of confidential information. In April, Polymarket has hired Chainanalysis—a leading blockchain analytics firm—to monitor its trading activities and to refine its 'detection methods.' It has also tapped Palantir and TWG AI to build what it calls a next generation '</w:t>
-      </w:r>
-      <w:r>
-        <w:rPr>
-          <w:rFonts w:ascii="Times New Roman" w:hAnsi="Times New Roman" w:cs="Times New Roman"/>
-          <w:sz w:val="28"/>
-          <w:szCs w:val="28"/>
-        </w:rPr>
-        <w:t>s</w:t>
-      </w:r>
-      <w:r>
-        <w:rPr>
-          <w:rFonts w:ascii="Times New Roman" w:hAnsi="Times New Roman" w:cs="Times New Roman"/>
-          <w:sz w:val="28"/>
-          <w:szCs w:val="28"/>
-        </w:rPr>
-        <w:t xml:space="preserve">ports </w:t>
-      </w:r>
-      <w:r>
-        <w:rPr>
-          <w:rFonts w:ascii="Times New Roman" w:hAnsi="Times New Roman" w:cs="Times New Roman"/>
-          <w:sz w:val="28"/>
-          <w:szCs w:val="28"/>
-        </w:rPr>
-        <w:t>i</w:t>
-      </w:r>
-      <w:r>
-        <w:rPr>
-          <w:rFonts w:ascii="Times New Roman" w:hAnsi="Times New Roman" w:cs="Times New Roman"/>
-          <w:sz w:val="28"/>
-          <w:szCs w:val="28"/>
-        </w:rPr>
-        <w:t xml:space="preserve">ntegrity </w:t>
-      </w:r>
-      <w:r>
-        <w:rPr>
-          <w:rFonts w:ascii="Times New Roman" w:hAnsi="Times New Roman" w:cs="Times New Roman"/>
-          <w:sz w:val="28"/>
-          <w:szCs w:val="28"/>
-        </w:rPr>
-        <w:t>p</w:t>
-      </w:r>
-      <w:r>
-        <w:rPr>
-          <w:rFonts w:ascii="Times New Roman" w:hAnsi="Times New Roman" w:cs="Times New Roman"/>
-          <w:sz w:val="28"/>
-          <w:szCs w:val="28"/>
-        </w:rPr>
-        <w:t>latform'.</w:t>
+        <w:t>In more recent months, the companies have changed their tune. The intense media scrutiny seemed to have spurred a policy reversal on the use of confidential information. In April, Polymarket hired Chainalysis—a leading blockchain analytics firm—to monitor its trading activities and to refine its 'detection methods.' It has also tapped Palantir and TWG AI to build what it calls a next generation 'sports integrity platform'.</w:t>
+      </w:r>
+      <w:r>
+        <w:rPr>
+          <w:rFonts w:ascii="Times New Roman" w:hAnsi="Times New Roman" w:cs="Times New Roman"/>
+          <w:sz w:val="28"/>
+          <w:szCs w:val="28"/>
+        </w:rPr>
+      </w:r>
+      <w:r>
+        <w:rPr>
+          <w:rFonts w:ascii="Times New Roman" w:hAnsi="Times New Roman" w:cs="Times New Roman"/>
+          <w:sz w:val="28"/>
+          <w:szCs w:val="28"/>
+        </w:rPr>
+      </w:r>
+      <w:r>
+        <w:rPr>
+          <w:rFonts w:ascii="Times New Roman" w:hAnsi="Times New Roman" w:cs="Times New Roman"/>
+          <w:sz w:val="28"/>
+          <w:szCs w:val="28"/>
+        </w:rPr>
+      </w:r>
+      <w:r>
+        <w:rPr>
+          <w:rFonts w:ascii="Times New Roman" w:hAnsi="Times New Roman" w:cs="Times New Roman"/>
+          <w:sz w:val="28"/>
+          <w:szCs w:val="28"/>
+        </w:rPr>
+      </w:r>
+      <w:r>
+        <w:rPr>
+          <w:rFonts w:ascii="Times New Roman" w:hAnsi="Times New Roman" w:cs="Times New Roman"/>
+          <w:sz w:val="28"/>
+          <w:szCs w:val="28"/>
+        </w:rPr>
+      </w:r>
+      <w:r>
+        <w:rPr>
+          <w:rFonts w:ascii="Times New Roman" w:hAnsi="Times New Roman" w:cs="Times New Roman"/>
+          <w:sz w:val="28"/>
+          <w:szCs w:val="28"/>
+        </w:rPr>
+      </w:r>
+      <w:r>
+        <w:rPr>
+          <w:rFonts w:ascii="Times New Roman" w:hAnsi="Times New Roman" w:cs="Times New Roman"/>
+          <w:sz w:val="28"/>
+          <w:szCs w:val="28"/>
+        </w:rPr>
+      </w:r>
+      <w:r>
+        <w:rPr>
+          <w:rFonts w:ascii="Times New Roman" w:hAnsi="Times New Roman" w:cs="Times New Roman"/>
+          <w:sz w:val="28"/>
+          <w:szCs w:val="28"/>
+        </w:rPr>
+      </w:r>
+      <w:r>
+        <w:rPr>
+          <w:rFonts w:ascii="Times New Roman" w:hAnsi="Times New Roman" w:cs="Times New Roman"/>
+          <w:sz w:val="28"/>
+          <w:szCs w:val="28"/>
+        </w:rPr>
+      </w:r>
+      <w:r>
+        <w:rPr>
+          <w:rFonts w:ascii="Times New Roman" w:hAnsi="Times New Roman" w:cs="Times New Roman"/>
+          <w:sz w:val="28"/>
+          <w:szCs w:val="28"/>
+        </w:rPr>
       </w:r>
     </w:p>
     <w:p>
@@ -2898,15 +2816,14 @@
           <w:sz w:val="28"/>
           <w:szCs w:val="28"/>
         </w:rPr>
-        <w:t>The recent arrest of Google Engineer Michele Spagnuolo (a.k.a AlphaRaccoon) for insider trading is a prime example.</w:t>
-      </w:r>
-      <w:r>
-        <w:rPr>
-          <w:rFonts w:ascii="Times New Roman" w:hAnsi="Times New Roman" w:cs="Times New Roman"/>
-          <w:sz w:val="28"/>
-          <w:szCs w:val="28"/>
-        </w:rPr>
-        <w:t xml:space="preserve"> Neither Google </w:t>
+        <w:t>The recent arrest of Google Engineer Michele Spagnuolo (a.k.a AlphaRaccoon) for insider trading is a prime example. Neither Google nor Polymarket has an incentive to allow such brazen rule-breaking. He said: "If I'm Google and I say to all employees let's go out there and use the company's information to bet... it would destroy any market in the long-term."</w:t>
+      </w:r>
+      <w:r>
+        <w:rPr>
+          <w:rFonts w:ascii="Times New Roman" w:hAnsi="Times New Roman" w:cs="Times New Roman"/>
+          <w:sz w:val="28"/>
+          <w:szCs w:val="28"/>
+        </w:rPr>
       </w:r>
       <w:proofErr w:type="gramStart"/>
       <w:r>
@@ -2915,7 +2832,6 @@
           <w:sz w:val="28"/>
           <w:szCs w:val="28"/>
         </w:rPr>
-        <w:t>or</w:t>
       </w:r>
       <w:proofErr w:type="gramEnd"/>
       <w:r>
@@ -2924,7 +2840,6 @@
           <w:sz w:val="28"/>
           <w:szCs w:val="28"/>
         </w:rPr>
-        <w:t xml:space="preserve"> Polymarket has an incentive to allow such brazen </w:t>
       </w:r>
       <w:proofErr w:type="gramStart"/>
       <w:r>
@@ -2933,7 +2848,6 @@
           <w:sz w:val="28"/>
           <w:szCs w:val="28"/>
         </w:rPr>
-        <w:t>rule-breaking</w:t>
       </w:r>
       <w:proofErr w:type="gramEnd"/>
       <w:r>
@@ -2942,15 +2856,13 @@
           <w:sz w:val="28"/>
           <w:szCs w:val="28"/>
         </w:rPr>
-        <w:t>.</w:t>
-      </w:r>
-      <w:r>
-        <w:rPr>
-          <w:rFonts w:ascii="Times New Roman" w:hAnsi="Times New Roman" w:cs="Times New Roman"/>
-          <w:sz w:val="28"/>
-          <w:szCs w:val="28"/>
-        </w:rPr>
-        <w:t xml:space="preserve"> He said: "If I'm Google and I say to all employees let's go out there and use the company's information to bet... it would destroy any market in the long-term."</w:t>
+      </w:r>
+      <w:r>
+        <w:rPr>
+          <w:rFonts w:ascii="Times New Roman" w:hAnsi="Times New Roman" w:cs="Times New Roman"/>
+          <w:sz w:val="28"/>
+          <w:szCs w:val="28"/>
+        </w:rPr>
       </w:r>
     </w:p>
     <w:p>
@@ -3036,47 +2948,42 @@
           <w:sz w:val="28"/>
           <w:szCs w:val="28"/>
         </w:rPr>
-        <w:t xml:space="preserve">Professor John Cheyne-Lippold, who researches digital futurity at the University of Michigan, does not share this </w:t>
-      </w:r>
-      <w:r>
-        <w:rPr>
-          <w:rFonts w:ascii="Times New Roman" w:hAnsi="Times New Roman" w:cs="Times New Roman"/>
-          <w:sz w:val="28"/>
-          <w:szCs w:val="28"/>
-        </w:rPr>
-        <w:t>optimism</w:t>
-      </w:r>
-      <w:r>
-        <w:rPr>
-          <w:rFonts w:ascii="Times New Roman" w:hAnsi="Times New Roman" w:cs="Times New Roman"/>
-          <w:sz w:val="28"/>
-          <w:szCs w:val="28"/>
-        </w:rPr>
-        <w:t>. The idea that prediction markets can be effectively controlled is a</w:t>
-      </w:r>
-      <w:r>
-        <w:rPr>
-          <w:rFonts w:ascii="Times New Roman" w:hAnsi="Times New Roman" w:cs="Times New Roman"/>
-          <w:sz w:val="28"/>
-          <w:szCs w:val="28"/>
-        </w:rPr>
-        <w:t>n</w:t>
-      </w:r>
-      <w:r>
-        <w:rPr>
-          <w:rFonts w:ascii="Times New Roman" w:hAnsi="Times New Roman" w:cs="Times New Roman"/>
-          <w:sz w:val="28"/>
-          <w:szCs w:val="28"/>
-        </w:rPr>
-        <w:t xml:space="preserve"> illusion. When you have markets on everything from the Israeli airstrikes to Brad Pitt's next marriage, policing </w:t>
-      </w:r>
-      <w:r>
-        <w:rPr>
-          <w:rFonts w:ascii="Times New Roman" w:hAnsi="Times New Roman" w:cs="Times New Roman"/>
-          <w:sz w:val="28"/>
-          <w:szCs w:val="28"/>
-        </w:rPr>
-        <w:t>them is likely to be futile.</w:t>
+        <w:t>Professor John Cheyne-Lippold, who researches digital futurity at the University of Michigan, does not share this optimism. The idea that prediction markets can be effectively controlled is an illusion, he argues. When there are markets on everything from the Israeli airstrikes to Brad Pitt's next marriage, policing them is likely to be futile.</w:t>
+      </w:r>
+      <w:r>
+        <w:rPr>
+          <w:rFonts w:ascii="Times New Roman" w:hAnsi="Times New Roman" w:cs="Times New Roman"/>
+          <w:sz w:val="28"/>
+          <w:szCs w:val="28"/>
+        </w:rPr>
+      </w:r>
+      <w:r>
+        <w:rPr>
+          <w:rFonts w:ascii="Times New Roman" w:hAnsi="Times New Roman" w:cs="Times New Roman"/>
+          <w:sz w:val="28"/>
+          <w:szCs w:val="28"/>
+        </w:rPr>
+      </w:r>
+      <w:r>
+        <w:rPr>
+          <w:rFonts w:ascii="Times New Roman" w:hAnsi="Times New Roman" w:cs="Times New Roman"/>
+          <w:sz w:val="28"/>
+          <w:szCs w:val="28"/>
+        </w:rPr>
+      </w:r>
+      <w:r>
+        <w:rPr>
+          <w:rFonts w:ascii="Times New Roman" w:hAnsi="Times New Roman" w:cs="Times New Roman"/>
+          <w:sz w:val="28"/>
+          <w:szCs w:val="28"/>
+        </w:rPr>
+      </w:r>
+      <w:r>
+        <w:rPr>
+          <w:rFonts w:ascii="Times New Roman" w:hAnsi="Times New Roman" w:cs="Times New Roman"/>
+          <w:sz w:val="28"/>
+          <w:szCs w:val="28"/>
+        </w:rPr>
       </w:r>
     </w:p>
     <w:p>
@@ -3094,15 +3001,14 @@
           <w:sz w:val="28"/>
           <w:szCs w:val="28"/>
         </w:rPr>
-        <w:t>"The regulations that enable you to go after it are impossible. If you financialize everything, then you</w:t>
-      </w:r>
-      <w:r>
-        <w:rPr>
-          <w:rFonts w:ascii="Times New Roman" w:hAnsi="Times New Roman" w:cs="Times New Roman"/>
-          <w:sz w:val="28"/>
-          <w:szCs w:val="28"/>
-        </w:rPr>
-        <w:t xml:space="preserve"> </w:t>
+        <w:t>"The regulations that enable you to go after it are impossible. If you financialize everything, then you have to regulate everything, and it's really hard to regulate everything," he said.</w:t>
+      </w:r>
+      <w:r>
+        <w:rPr>
+          <w:rFonts w:ascii="Times New Roman" w:hAnsi="Times New Roman" w:cs="Times New Roman"/>
+          <w:sz w:val="28"/>
+          <w:szCs w:val="28"/>
+        </w:rPr>
       </w:r>
       <w:proofErr w:type="gramStart"/>
       <w:r>
@@ -3111,7 +3017,6 @@
           <w:sz w:val="28"/>
           <w:szCs w:val="28"/>
         </w:rPr>
-        <w:t>have to</w:t>
       </w:r>
       <w:proofErr w:type="gramEnd"/>
       <w:r>
@@ -3120,15 +3025,13 @@
           <w:sz w:val="28"/>
           <w:szCs w:val="28"/>
         </w:rPr>
-        <w:t xml:space="preserve"> </w:t>
-      </w:r>
-      <w:r>
-        <w:rPr>
-          <w:rFonts w:ascii="Times New Roman" w:hAnsi="Times New Roman" w:cs="Times New Roman"/>
-          <w:sz w:val="28"/>
-          <w:szCs w:val="28"/>
-        </w:rPr>
-        <w:t xml:space="preserve">regulate everything, and it's </w:t>
+      </w:r>
+      <w:r>
+        <w:rPr>
+          <w:rFonts w:ascii="Times New Roman" w:hAnsi="Times New Roman" w:cs="Times New Roman"/>
+          <w:sz w:val="28"/>
+          <w:szCs w:val="28"/>
+        </w:rPr>
       </w:r>
       <w:proofErr w:type="gramStart"/>
       <w:r>
@@ -3137,7 +3040,6 @@
           <w:sz w:val="28"/>
           <w:szCs w:val="28"/>
         </w:rPr>
-        <w:t>really hard</w:t>
       </w:r>
       <w:proofErr w:type="gramEnd"/>
       <w:r>
@@ -3146,7 +3048,6 @@
           <w:sz w:val="28"/>
           <w:szCs w:val="28"/>
         </w:rPr>
-        <w:t xml:space="preserve"> to regulate everything," he argues.</w:t>
       </w:r>
     </w:p>
     <w:p>
@@ -3347,7 +3248,7 @@
           <w:sz w:val="28"/>
           <w:szCs w:val="28"/>
         </w:rPr>
-        <w:t>"People are betting on how Love Island is going to end. How can you? That's insane. It already is finished, you know. For certain, that some people know that information."</w:t>
+        <w:t>"People are betting on how Love Island is going to end. How can you? That's insane. It already is finished, you know. For certain, some people know that information."</w:t>
       </w:r>
     </w:p>
     <w:p>
@@ -3510,23 +3411,21 @@
           <w:sz w:val="28"/>
           <w:szCs w:val="28"/>
         </w:rPr>
-        <w:t xml:space="preserve">In an interview with WIRED, Selig claimed the CFTC is using AI to </w:t>
-      </w:r>
-      <w:r>
-        <w:rPr>
-          <w:rFonts w:ascii="Times New Roman" w:hAnsi="Times New Roman" w:cs="Times New Roman"/>
-          <w:sz w:val="28"/>
-          <w:szCs w:val="28"/>
-        </w:rPr>
-        <w:t xml:space="preserve">analyze </w:t>
-      </w:r>
-      <w:r>
-        <w:rPr>
-          <w:rFonts w:ascii="Times New Roman" w:hAnsi="Times New Roman" w:cs="Times New Roman"/>
-          <w:sz w:val="28"/>
-          <w:szCs w:val="28"/>
-        </w:rPr>
-        <w:t>hundreds, thousands of suspicious wallets. As of July, however, no one has been arrested or prosecuted in relation to Iran.</w:t>
+        <w:t>In an interview with WIRED, Selig claimed the CFTC is using AI to analyze hundreds of thousands of suspicious wallets. As of July, however, no one has been arrested or prosecuted in relation to Iran.</w:t>
+      </w:r>
+      <w:r>
+        <w:rPr>
+          <w:rFonts w:ascii="Times New Roman" w:hAnsi="Times New Roman" w:cs="Times New Roman"/>
+          <w:sz w:val="28"/>
+          <w:szCs w:val="28"/>
+        </w:rPr>
+      </w:r>
+      <w:r>
+        <w:rPr>
+          <w:rFonts w:ascii="Times New Roman" w:hAnsi="Times New Roman" w:cs="Times New Roman"/>
+          <w:sz w:val="28"/>
+          <w:szCs w:val="28"/>
+        </w:rPr>
       </w:r>
     </w:p>
     <w:p>
@@ -3640,7 +3539,7 @@
           <w:sz w:val="28"/>
           <w:szCs w:val="28"/>
         </w:rPr>
-        <w:t>The future has become a gold rush. On 24 June, Mark Zuckerberg announced that Meta would develop its own prediction market called 'Arena'. He will join Coinbase, Smarkets, PredictIt, Crypto.com, Versus in an increasingly crowded landscape that offers odds on the world of tomorrow.</w:t>
+        <w:t>Our future has become a gold rush. On 24th June, Mark Zuckerberg announced that Meta would develop its own prediction market called 'Arena'. He will join Coinbase, Smarkets, PredictIt, Crypto.com, Versus in an increasingly crowded landscape that offers odds on the world of tomorrow.</w:t>
       </w:r>
     </w:p>
     <w:p>
@@ -3748,7 +3647,7 @@
           <w:sz w:val="28"/>
           <w:szCs w:val="28"/>
         </w:rPr>
-        <w:t>The backlash is equally fervent, with nearly every major media outlet publishing some sort of exposé on the prediction industry. Early accusations of 'immorality' have given way to more detailed investigations on deceptive advertising or the unusual win rate of politics markets.</w:t>
+        <w:t>The backlash against them is equally fervent, with nearly every major media outlet publishing some sort of exposé on the prediction industry. Early accusations of 'immorality' have given way to more detailed investigations on deceptive advertising or the unusual win rate of politics markets.</w:t>
       </w:r>
     </w:p>
     <w:p>
@@ -3766,7 +3665,7 @@
           <w:sz w:val="28"/>
           <w:szCs w:val="28"/>
         </w:rPr>
-        <w:t>Even professional forecasters like Simon who've made careers from prediction are wary of the industry's association with gambling. In a utopian world, he says, prediction markets can serve as a useful financial instrument for companies to hedge risk—much like derivatives. For example, big companies could set up expected negative value bets to insure themselves from outcomes in the real world.</w:t>
+        <w:t>Even professional forecasters like Simon who've made careers from prediction are wary of the industry's association with gambling. In a utopian world, he says, prediction markets can serve as a useful financial instrument for companies to hedge risk—much like derivatives. For example, big companies could set up expected negative value bets to insure themselves against outcomes in the real world.</w:t>
       </w:r>
     </w:p>
     <w:p>
@@ -3930,32 +3829,28 @@
           <w:sz w:val="28"/>
           <w:szCs w:val="28"/>
         </w:rPr>
-        <w:t>In his view, it is not just the promise of riches, but the diminishing returns from a precarious present. Capitalism without monopoly operates under the law of depreciating returns, he argues.</w:t>
-      </w:r>
-      <w:r>
-        <w:rPr>
-          <w:rFonts w:ascii="Times New Roman" w:hAnsi="Times New Roman" w:cs="Times New Roman"/>
-          <w:sz w:val="28"/>
-          <w:szCs w:val="28"/>
-        </w:rPr>
-        <w:t xml:space="preserve"> It needs to expand in other to survive.</w:t>
-      </w:r>
-      <w:r>
-        <w:rPr>
-          <w:rFonts w:ascii="Times New Roman" w:hAnsi="Times New Roman" w:cs="Times New Roman"/>
-          <w:sz w:val="28"/>
-          <w:szCs w:val="28"/>
-        </w:rPr>
-        <w:t xml:space="preserve"> </w:t>
-      </w:r>
-      <w:r>
-        <w:rPr>
-          <w:rFonts w:ascii="Times New Roman" w:hAnsi="Times New Roman" w:cs="Times New Roman"/>
-          <w:sz w:val="28"/>
-          <w:szCs w:val="28"/>
-        </w:rPr>
-        <w:lastRenderedPageBreak/>
-        <w:t>"If you have Little Caesars and Pizza Hut competing against each other, the profit margins are going to get thinner and thinner. Which is why you have to move abroad, import immigrant labour that you can pay very cheaply, or source materials from Sri Lanka instead of Detroit."</w:t>
+        <w:t>In his view, it is not just the promise of riches, but the diminishing returns from a precarious present. Capitalism without monopoly operates under the law of depreciating returns, he argues. It needs to expand in order to survive. "If you have Little Caesars and Pizza Hut competing against each other, the profit margins are going to get thinner and thinner. Which is why you have to move abroad, import immigrant labour that you can pay very cheaply, or source materials from Sri Lanka instead of Detroit."</w:t>
+      </w:r>
+      <w:r>
+        <w:rPr>
+          <w:rFonts w:ascii="Times New Roman" w:hAnsi="Times New Roman" w:cs="Times New Roman"/>
+          <w:sz w:val="28"/>
+          <w:szCs w:val="28"/>
+        </w:rPr>
+      </w:r>
+      <w:r>
+        <w:rPr>
+          <w:rFonts w:ascii="Times New Roman" w:hAnsi="Times New Roman" w:cs="Times New Roman"/>
+          <w:sz w:val="28"/>
+          <w:szCs w:val="28"/>
+        </w:rPr>
+      </w:r>
+      <w:r>
+        <w:rPr>
+          <w:rFonts w:ascii="Times New Roman" w:hAnsi="Times New Roman" w:cs="Times New Roman"/>
+          <w:sz w:val="28"/>
+          <w:szCs w:val="28"/>
+        </w:rPr>
       </w:r>
     </w:p>
     <w:p>
@@ -3991,47 +3886,42 @@
           <w:sz w:val="28"/>
           <w:szCs w:val="28"/>
         </w:rPr>
-        <w:t xml:space="preserve">As an 'annoying professor', he is critical of how the future is being rapidly financialised. In practice, </w:t>
-      </w:r>
-      <w:r>
-        <w:rPr>
-          <w:rFonts w:ascii="Times New Roman" w:hAnsi="Times New Roman" w:cs="Times New Roman"/>
-          <w:sz w:val="28"/>
-          <w:szCs w:val="28"/>
-        </w:rPr>
-        <w:t xml:space="preserve">however, </w:t>
-      </w:r>
-      <w:r>
-        <w:rPr>
-          <w:rFonts w:ascii="Times New Roman" w:hAnsi="Times New Roman" w:cs="Times New Roman"/>
-          <w:sz w:val="28"/>
-          <w:szCs w:val="28"/>
-        </w:rPr>
-        <w:t xml:space="preserve">he believes the 'genie's out of the bottle'. Much like </w:t>
-      </w:r>
-      <w:r>
-        <w:rPr>
-          <w:rFonts w:ascii="Times New Roman" w:hAnsi="Times New Roman" w:cs="Times New Roman"/>
-          <w:sz w:val="28"/>
-          <w:szCs w:val="28"/>
-        </w:rPr>
-        <w:t>B</w:t>
-      </w:r>
-      <w:r>
-        <w:rPr>
-          <w:rFonts w:ascii="Times New Roman" w:hAnsi="Times New Roman" w:cs="Times New Roman"/>
-          <w:sz w:val="28"/>
-          <w:szCs w:val="28"/>
-        </w:rPr>
-        <w:t>itcoin or the online piracy, people are going to find a way to participate and profit from these markets</w:t>
-      </w:r>
-      <w:r>
-        <w:rPr>
-          <w:rFonts w:ascii="Times New Roman" w:hAnsi="Times New Roman" w:cs="Times New Roman"/>
-          <w:sz w:val="28"/>
-          <w:szCs w:val="28"/>
-        </w:rPr>
-        <w:t>, regardless of what the rules are.</w:t>
+        <w:t>As an 'annoying professor', he is critical of how the future is being rapidly financialised. In practice, however, he believes the 'genie's out of the bottle'. Much like Bitcoin or online piracy, people are going to find a way to participate and profit from these markets, regardless of what the rules are.</w:t>
+      </w:r>
+      <w:r>
+        <w:rPr>
+          <w:rFonts w:ascii="Times New Roman" w:hAnsi="Times New Roman" w:cs="Times New Roman"/>
+          <w:sz w:val="28"/>
+          <w:szCs w:val="28"/>
+        </w:rPr>
+      </w:r>
+      <w:r>
+        <w:rPr>
+          <w:rFonts w:ascii="Times New Roman" w:hAnsi="Times New Roman" w:cs="Times New Roman"/>
+          <w:sz w:val="28"/>
+          <w:szCs w:val="28"/>
+        </w:rPr>
+      </w:r>
+      <w:r>
+        <w:rPr>
+          <w:rFonts w:ascii="Times New Roman" w:hAnsi="Times New Roman" w:cs="Times New Roman"/>
+          <w:sz w:val="28"/>
+          <w:szCs w:val="28"/>
+        </w:rPr>
+      </w:r>
+      <w:r>
+        <w:rPr>
+          <w:rFonts w:ascii="Times New Roman" w:hAnsi="Times New Roman" w:cs="Times New Roman"/>
+          <w:sz w:val="28"/>
+          <w:szCs w:val="28"/>
+        </w:rPr>
+      </w:r>
+      <w:r>
+        <w:rPr>
+          <w:rFonts w:ascii="Times New Roman" w:hAnsi="Times New Roman" w:cs="Times New Roman"/>
+          <w:sz w:val="28"/>
+          <w:szCs w:val="28"/>
+        </w:rPr>
       </w:r>
     </w:p>
     <w:p>
@@ -4049,7 +3939,7 @@
           <w:sz w:val="28"/>
           <w:szCs w:val="28"/>
         </w:rPr>
-        <w:t xml:space="preserve">"Society doesn't work in this way. You can't just shake your finger at it and </w:t>
+        <w:t>"Society doesn't work in this way. You can't just shake your finger at it and say 'go back to where it was'. I think we're going to see more and more institutions and people following these markets because there's a huge amount of money on it, just like cryptocurrency."</w:t>
       </w:r>
       <w:proofErr w:type="gramStart"/>
       <w:r>
@@ -4058,7 +3948,6 @@
           <w:sz w:val="28"/>
           <w:szCs w:val="28"/>
         </w:rPr>
-        <w:t>say</w:t>
       </w:r>
       <w:proofErr w:type="gramEnd"/>
       <w:r>
@@ -4067,7 +3956,6 @@
           <w:sz w:val="28"/>
           <w:szCs w:val="28"/>
         </w:rPr>
-        <w:t xml:space="preserve"> 'go back to where it was.' I think we're going to see more and more institutions and people following these markets because there's a huge amount of money on it, just like cryptocurrency."</w:t>
       </w:r>
     </w:p>
     <w:p>
@@ -4137,7 +4025,7 @@
           <w:sz w:val="28"/>
           <w:szCs w:val="28"/>
         </w:rPr>
-        <w:t xml:space="preserve">In early April, it made a $67,592 bet that a US-Iran ceasefire would be reached by April 7th. Once again, he was proven right. The investment yielded a nearly 1000% return worth $433,481-a sum large enough to draw the suspicion of the Wall Street Journal. Just like before, the user would withdraw </w:t>
+        <w:t>In early April, it made a US$67,592 bet that a US-Iran ceasefire would be reached by April 7th. Once again, he was proven right. The investment yielded a nearly 1000% return worth US$433,481-a sum large enough to draw the suspicion of the Wall Street Journal. Just like before, the user would withdraw all of its winnings by the next day before leaving Polymarket for good.</w:t>
       </w:r>
       <w:proofErr w:type="gramStart"/>
       <w:r>
@@ -4146,7 +4034,6 @@
           <w:sz w:val="28"/>
           <w:szCs w:val="28"/>
         </w:rPr>
-        <w:t>all of</w:t>
       </w:r>
       <w:proofErr w:type="gramEnd"/>
       <w:r>
@@ -4155,23 +4042,20 @@
           <w:sz w:val="28"/>
           <w:szCs w:val="28"/>
         </w:rPr>
-        <w:t xml:space="preserve"> its winnings by the next day</w:t>
-      </w:r>
-      <w:r>
-        <w:rPr>
-          <w:rFonts w:ascii="Times New Roman" w:hAnsi="Times New Roman" w:cs="Times New Roman"/>
-          <w:sz w:val="28"/>
-          <w:szCs w:val="28"/>
-        </w:rPr>
-        <w:t xml:space="preserve"> before</w:t>
-      </w:r>
-      <w:r>
-        <w:rPr>
-          <w:rFonts w:ascii="Times New Roman" w:hAnsi="Times New Roman" w:cs="Times New Roman"/>
-          <w:sz w:val="28"/>
-          <w:szCs w:val="28"/>
-        </w:rPr>
-        <w:t xml:space="preserve"> leaving Polymarket for good.</w:t>
+      </w:r>
+      <w:r>
+        <w:rPr>
+          <w:rFonts w:ascii="Times New Roman" w:hAnsi="Times New Roman" w:cs="Times New Roman"/>
+          <w:sz w:val="28"/>
+          <w:szCs w:val="28"/>
+        </w:rPr>
+      </w:r>
+      <w:r>
+        <w:rPr>
+          <w:rFonts w:ascii="Times New Roman" w:hAnsi="Times New Roman" w:cs="Times New Roman"/>
+          <w:sz w:val="28"/>
+          <w:szCs w:val="28"/>
+        </w:rPr>
       </w:r>
     </w:p>
     <w:p>
@@ -4189,79 +4073,70 @@
           <w:sz w:val="28"/>
           <w:szCs w:val="28"/>
         </w:rPr>
-        <w:t xml:space="preserve">Is djijaij83 a </w:t>
-      </w:r>
-      <w:r>
-        <w:rPr>
-          <w:rFonts w:ascii="Times New Roman" w:hAnsi="Times New Roman" w:cs="Times New Roman"/>
-          <w:sz w:val="28"/>
-          <w:szCs w:val="28"/>
-        </w:rPr>
-        <w:t>gifted f</w:t>
-      </w:r>
-      <w:r>
-        <w:rPr>
-          <w:rFonts w:ascii="Times New Roman" w:hAnsi="Times New Roman" w:cs="Times New Roman"/>
-          <w:sz w:val="28"/>
-          <w:szCs w:val="28"/>
-        </w:rPr>
-        <w:t xml:space="preserve">orecaster who can read the tea leaves better than 99% of experts, or </w:t>
-      </w:r>
-      <w:r>
-        <w:rPr>
-          <w:rFonts w:ascii="Times New Roman" w:hAnsi="Times New Roman" w:cs="Times New Roman"/>
-          <w:sz w:val="28"/>
-          <w:szCs w:val="28"/>
-        </w:rPr>
-        <w:t xml:space="preserve">s </w:t>
-      </w:r>
-      <w:r>
-        <w:rPr>
-          <w:rFonts w:ascii="Times New Roman" w:hAnsi="Times New Roman" w:cs="Times New Roman"/>
-          <w:sz w:val="28"/>
-          <w:szCs w:val="28"/>
-        </w:rPr>
-        <w:t xml:space="preserve">well-placed </w:t>
-      </w:r>
-      <w:r>
-        <w:rPr>
-          <w:rFonts w:ascii="Times New Roman" w:hAnsi="Times New Roman" w:cs="Times New Roman"/>
-          <w:sz w:val="28"/>
-          <w:szCs w:val="28"/>
-        </w:rPr>
-        <w:t>staffer</w:t>
-      </w:r>
-      <w:r>
-        <w:rPr>
-          <w:rFonts w:ascii="Times New Roman" w:hAnsi="Times New Roman" w:cs="Times New Roman"/>
-          <w:sz w:val="28"/>
-          <w:szCs w:val="28"/>
-        </w:rPr>
-        <w:t xml:space="preserve"> in some corner of the White House? The question is crucial for the future of </w:t>
-      </w:r>
-      <w:r>
-        <w:rPr>
-          <w:rFonts w:ascii="Times New Roman" w:hAnsi="Times New Roman" w:cs="Times New Roman"/>
-          <w:sz w:val="28"/>
-          <w:szCs w:val="28"/>
-        </w:rPr>
-        <w:t xml:space="preserve">for-profit </w:t>
-      </w:r>
-      <w:r>
-        <w:rPr>
-          <w:rFonts w:ascii="Times New Roman" w:hAnsi="Times New Roman" w:cs="Times New Roman"/>
-          <w:sz w:val="28"/>
-          <w:szCs w:val="28"/>
-        </w:rPr>
-        <w:t>prediction markets</w:t>
-      </w:r>
-      <w:r>
-        <w:rPr>
-          <w:rFonts w:ascii="Times New Roman" w:hAnsi="Times New Roman" w:cs="Times New Roman"/>
-          <w:sz w:val="28"/>
-          <w:szCs w:val="28"/>
-        </w:rPr>
-        <w:t>, but there nobody in power seems particularly interested in finding the answers.</w:t>
+        <w:t>Is djijaij83 a gifted forecaster who can read the tea leaves better than 99% of experts, or a well-placed staffer in some corner of the White House? The question is crucial for the future of for-profit prediction markets, but nobody in power seems particularly interested in finding the answers.</w:t>
+      </w:r>
+      <w:r>
+        <w:rPr>
+          <w:rFonts w:ascii="Times New Roman" w:hAnsi="Times New Roman" w:cs="Times New Roman"/>
+          <w:sz w:val="28"/>
+          <w:szCs w:val="28"/>
+        </w:rPr>
+      </w:r>
+      <w:r>
+        <w:rPr>
+          <w:rFonts w:ascii="Times New Roman" w:hAnsi="Times New Roman" w:cs="Times New Roman"/>
+          <w:sz w:val="28"/>
+          <w:szCs w:val="28"/>
+        </w:rPr>
+      </w:r>
+      <w:r>
+        <w:rPr>
+          <w:rFonts w:ascii="Times New Roman" w:hAnsi="Times New Roman" w:cs="Times New Roman"/>
+          <w:sz w:val="28"/>
+          <w:szCs w:val="28"/>
+        </w:rPr>
+      </w:r>
+      <w:r>
+        <w:rPr>
+          <w:rFonts w:ascii="Times New Roman" w:hAnsi="Times New Roman" w:cs="Times New Roman"/>
+          <w:sz w:val="28"/>
+          <w:szCs w:val="28"/>
+        </w:rPr>
+      </w:r>
+      <w:r>
+        <w:rPr>
+          <w:rFonts w:ascii="Times New Roman" w:hAnsi="Times New Roman" w:cs="Times New Roman"/>
+          <w:sz w:val="28"/>
+          <w:szCs w:val="28"/>
+        </w:rPr>
+      </w:r>
+      <w:r>
+        <w:rPr>
+          <w:rFonts w:ascii="Times New Roman" w:hAnsi="Times New Roman" w:cs="Times New Roman"/>
+          <w:sz w:val="28"/>
+          <w:szCs w:val="28"/>
+        </w:rPr>
+      </w:r>
+      <w:r>
+        <w:rPr>
+          <w:rFonts w:ascii="Times New Roman" w:hAnsi="Times New Roman" w:cs="Times New Roman"/>
+          <w:sz w:val="28"/>
+          <w:szCs w:val="28"/>
+        </w:rPr>
+      </w:r>
+      <w:r>
+        <w:rPr>
+          <w:rFonts w:ascii="Times New Roman" w:hAnsi="Times New Roman" w:cs="Times New Roman"/>
+          <w:sz w:val="28"/>
+          <w:szCs w:val="28"/>
+        </w:rPr>
+      </w:r>
+      <w:r>
+        <w:rPr>
+          <w:rFonts w:ascii="Times New Roman" w:hAnsi="Times New Roman" w:cs="Times New Roman"/>
+          <w:sz w:val="28"/>
+          <w:szCs w:val="28"/>
+        </w:rPr>
       </w:r>
     </w:p>
     <w:p>
@@ -4279,16 +4154,14 @@
           <w:sz w:val="28"/>
           <w:szCs w:val="28"/>
         </w:rPr>
-        <w:lastRenderedPageBreak/>
-        <w:t xml:space="preserve">Only the future knows. For now, </w:t>
-      </w:r>
-      <w:r>
-        <w:rPr>
-          <w:rFonts w:ascii="Times New Roman" w:hAnsi="Times New Roman" w:cs="Times New Roman"/>
-          <w:sz w:val="28"/>
-          <w:szCs w:val="28"/>
-        </w:rPr>
-        <w:t>the best answer we have is a statistical probability. On Manifold, there is a market forecasting the affiliation of the next insider to be arrested. The odds are as follow: 58% Israeli Defense Forces, 39% OpenAI, 39% SpaceX, 36% KPMG, 34% Mr. Beast and 33% Amazon.</w:t>
+        <w:t>Only the future knows. For now, the best answer we have is a statistical probability. On Manifold, there is a market forecasting the affiliation of the next insider to be arrested. The odds are as follows: 58% Israeli Defense Forces, 39% OpenAI, 39% SpaceX, 36% KPMG, 34% Mr. Beast and 33% Amazon.</w:t>
+      </w:r>
+      <w:r>
+        <w:rPr>
+          <w:rFonts w:ascii="Times New Roman" w:hAnsi="Times New Roman" w:cs="Times New Roman"/>
+          <w:sz w:val="28"/>
+          <w:szCs w:val="28"/>
+        </w:rPr>
       </w:r>
     </w:p>
     <w:p>
@@ -4346,7 +4219,7 @@
           <w:sz w:val="28"/>
           <w:szCs w:val="28"/>
         </w:rPr>
-        <w:t>With thanks to Jon Reiter, 'Simon', Hannah Su, Professor John Cheyne-Lippold, Dr David Young, Andy Freeman, Josh Cheetham, Nathan Walker and everyone forced to listen to me ramble about CLOB servers. Contact me at pannjie@gmail.com.</w:t>
+        <w:t>With thanks to Jon Reiter, 'Simon', Hannah Su, Professor John Cheyne-Lippold, Dr David Young, Andy Freeman, Josh Cheetham, Nathan Walker, Yeo Boon Ping, Mark Tan and everyone forced to listen to me ramble about CLOB servers. Contact me at pannjie@gmail.com.</w:t>
       </w:r>
     </w:p>
     <w:sectPr>

</xml_diff>